<commit_message>
Fixed bugs, everything working up to EZ-chi
</commit_message>
<xml_diff>
--- a/r_pipeline.docx
+++ b/r_pipeline.docx
@@ -1,6 +1,6 @@
 
 <file path=word/document.xml><?xml version="1.0" encoding="utf-8"?>
-<w:document xmlns:wpc="http://schemas.microsoft.com/office/word/2010/wordprocessingCanvas" xmlns:cx="http://schemas.microsoft.com/office/drawing/2014/chartex" xmlns:cx1="http://schemas.microsoft.com/office/drawing/2015/9/8/chartex" xmlns:cx2="http://schemas.microsoft.com/office/drawing/2015/10/21/chartex" xmlns:cx3="http://schemas.microsoft.com/office/drawing/2016/5/9/chartex" xmlns:cx4="http://schemas.microsoft.com/office/drawing/2016/5/10/chartex" xmlns:cx5="http://schemas.microsoft.com/office/drawing/2016/5/11/chartex" xmlns:cx6="http://schemas.microsoft.com/office/drawing/2016/5/12/chartex" xmlns:cx7="http://schemas.microsoft.com/office/drawing/2016/5/13/chartex" xmlns:cx8="http://schemas.microsoft.com/office/drawing/2016/5/14/chartex" xmlns:mc="http://schemas.openxmlformats.org/markup-compatibility/2006" xmlns:aink="http://schemas.microsoft.com/office/drawing/2016/ink" xmlns:am3d="http://schemas.microsoft.com/office/drawing/2017/model3d" xmlns:o="urn:schemas-microsoft-com:office:office" xmlns:oel="http://schemas.microsoft.com/office/2019/extlst" xmlns:r="http://schemas.openxmlformats.org/officeDocument/2006/relationships" xmlns:m="http://schemas.openxmlformats.org/officeDocument/2006/math" xmlns:v="urn:schemas-microsoft-com:vml" xmlns:wp14="http://schemas.microsoft.com/office/word/2010/wordprocessingDrawing" xmlns:wp="http://schemas.openxmlformats.org/drawingml/2006/wordprocessingDrawing" xmlns:w10="urn:schemas-microsoft-com:office:word" xmlns:w="http://schemas.openxmlformats.org/wordprocessingml/2006/main" xmlns:w14="http://schemas.microsoft.com/office/word/2010/wordml" xmlns:w15="http://schemas.microsoft.com/office/word/2012/wordml" xmlns:w16cex="http://schemas.microsoft.com/office/word/2018/wordml/cex" xmlns:w16cid="http://schemas.microsoft.com/office/word/2016/wordml/cid" xmlns:w16="http://schemas.microsoft.com/office/word/2018/wordml" xmlns:w16du="http://schemas.microsoft.com/office/word/2023/wordml/word16du" xmlns:w16sdtdh="http://schemas.microsoft.com/office/word/2020/wordml/sdtdatahash" xmlns:w16se="http://schemas.microsoft.com/office/word/2015/wordml/symex" xmlns:wpg="http://schemas.microsoft.com/office/word/2010/wordprocessingGroup" xmlns:wpi="http://schemas.microsoft.com/office/word/2010/wordprocessingInk" xmlns:wne="http://schemas.microsoft.com/office/word/2006/wordml" xmlns:wps="http://schemas.microsoft.com/office/word/2010/wordprocessingShape" mc:Ignorable="w14 w15 w16se w16cid w16 w16cex w16sdtdh w16du wp14">
+<w:document xmlns:wpc="http://schemas.microsoft.com/office/word/2010/wordprocessingCanvas" xmlns:cx="http://schemas.microsoft.com/office/drawing/2014/chartex" xmlns:cx1="http://schemas.microsoft.com/office/drawing/2015/9/8/chartex" xmlns:cx2="http://schemas.microsoft.com/office/drawing/2015/10/21/chartex" xmlns:cx3="http://schemas.microsoft.com/office/drawing/2016/5/9/chartex" xmlns:cx4="http://schemas.microsoft.com/office/drawing/2016/5/10/chartex" xmlns:cx5="http://schemas.microsoft.com/office/drawing/2016/5/11/chartex" xmlns:cx6="http://schemas.microsoft.com/office/drawing/2016/5/12/chartex" xmlns:cx7="http://schemas.microsoft.com/office/drawing/2016/5/13/chartex" xmlns:cx8="http://schemas.microsoft.com/office/drawing/2016/5/14/chartex" xmlns:mc="http://schemas.openxmlformats.org/markup-compatibility/2006" xmlns:aink="http://schemas.microsoft.com/office/drawing/2016/ink" xmlns:am3d="http://schemas.microsoft.com/office/drawing/2017/model3d" xmlns:o="urn:schemas-microsoft-com:office:office" xmlns:oel="http://schemas.microsoft.com/office/2019/extlst" xmlns:r="http://schemas.openxmlformats.org/officeDocument/2006/relationships" xmlns:m="http://schemas.openxmlformats.org/officeDocument/2006/math" xmlns:v="urn:schemas-microsoft-com:vml" xmlns:wp14="http://schemas.microsoft.com/office/word/2010/wordprocessingDrawing" xmlns:wp="http://schemas.openxmlformats.org/drawingml/2006/wordprocessingDrawing" xmlns:w10="urn:schemas-microsoft-com:office:word" xmlns:w="http://schemas.openxmlformats.org/wordprocessingml/2006/main" xmlns:w14="http://schemas.microsoft.com/office/word/2010/wordml" xmlns:w15="http://schemas.microsoft.com/office/word/2012/wordml" xmlns:w16cex="http://schemas.microsoft.com/office/word/2018/wordml/cex" xmlns:w16cid="http://schemas.microsoft.com/office/word/2016/wordml/cid" xmlns:w16="http://schemas.microsoft.com/office/word/2018/wordml" xmlns:w16du="http://schemas.microsoft.com/office/word/2023/wordml/word16du" xmlns:w16sdtdh="http://schemas.microsoft.com/office/word/2020/wordml/sdtdatahash" xmlns:w16sdtfl="http://schemas.microsoft.com/office/word/2024/wordml/sdtformatlock" xmlns:w16se="http://schemas.microsoft.com/office/word/2015/wordml/symex" xmlns:wpg="http://schemas.microsoft.com/office/word/2010/wordprocessingGroup" xmlns:wpi="http://schemas.microsoft.com/office/word/2010/wordprocessingInk" xmlns:wne="http://schemas.microsoft.com/office/word/2006/wordml" xmlns:wps="http://schemas.microsoft.com/office/word/2010/wordprocessingShape" mc:Ignorable="w14 w15 w16se w16cid w16 w16cex w16sdtdh w16sdtfl w16du wp14">
   <w:body>
     <w:p>
       <w:pPr>
@@ -123,19 +123,16 @@
       <w:pPr>
         <w:spacing w:after="0" w:line="240" w:lineRule="auto"/>
       </w:pPr>
-      <w:proofErr w:type="spellStart"/>
       <w:proofErr w:type="gramStart"/>
       <w:r>
         <w:t>spliter.r</w:t>
       </w:r>
-      <w:proofErr w:type="spellEnd"/>
-      <w:proofErr w:type="gramEnd"/>
-    </w:p>
-    <w:p>
-      <w:pPr>
-        <w:spacing w:after="0" w:line="240" w:lineRule="auto"/>
-      </w:pPr>
-      <w:proofErr w:type="spellStart"/>
+      <w:proofErr w:type="gramEnd"/>
+    </w:p>
+    <w:p>
+      <w:pPr>
+        <w:spacing w:after="0" w:line="240" w:lineRule="auto"/>
+      </w:pPr>
       <w:proofErr w:type="gramStart"/>
       <w:r>
         <w:t>physmap</w:t>
@@ -146,7 +143,6 @@
       <w:r>
         <w:t>r</w:t>
       </w:r>
-      <w:proofErr w:type="spellEnd"/>
       <w:proofErr w:type="gramEnd"/>
     </w:p>
     <w:p>
@@ -207,32 +203,18 @@
       </w:pPr>
       <w:r>
         <w:tab/>
-        <w:t>easy_chi.cpp</w:t>
-      </w:r>
-    </w:p>
-    <w:p>
-      <w:pPr>
-        <w:spacing w:after="0" w:line="240" w:lineRule="auto"/>
-      </w:pPr>
-      <w:r>
-        <w:tab/>
-      </w:r>
-      <w:proofErr w:type="spellStart"/>
-      <w:r>
         <w:t>easy_chi_</w:t>
       </w:r>
       <w:proofErr w:type="gramStart"/>
       <w:r>
         <w:t>fun.r</w:t>
       </w:r>
-      <w:proofErr w:type="spellEnd"/>
-      <w:proofErr w:type="gramEnd"/>
-    </w:p>
-    <w:p>
-      <w:pPr>
-        <w:spacing w:after="0" w:line="240" w:lineRule="auto"/>
-      </w:pPr>
-      <w:proofErr w:type="spellStart"/>
+      <w:proofErr w:type="gramEnd"/>
+    </w:p>
+    <w:p>
+      <w:pPr>
+        <w:spacing w:after="0" w:line="240" w:lineRule="auto"/>
+      </w:pPr>
       <w:proofErr w:type="gramStart"/>
       <w:r>
         <w:t>a</w:t>
@@ -243,14 +225,12 @@
       <w:r>
         <w:t>r</w:t>
       </w:r>
-      <w:proofErr w:type="spellEnd"/>
-      <w:proofErr w:type="gramEnd"/>
-    </w:p>
-    <w:p>
-      <w:pPr>
-        <w:spacing w:after="0" w:line="240" w:lineRule="auto"/>
-      </w:pPr>
-      <w:proofErr w:type="spellStart"/>
+      <w:proofErr w:type="gramEnd"/>
+    </w:p>
+    <w:p>
+      <w:pPr>
+        <w:spacing w:after="0" w:line="240" w:lineRule="auto"/>
+      </w:pPr>
       <w:proofErr w:type="gramStart"/>
       <w:r>
         <w:t>r</w:t>
@@ -261,7 +241,6 @@
       <w:r>
         <w:t>r</w:t>
       </w:r>
-      <w:proofErr w:type="spellEnd"/>
       <w:proofErr w:type="gramEnd"/>
     </w:p>
     <w:p>
@@ -277,15 +256,7 @@
         <w:t>Read counts</w:t>
       </w:r>
       <w:r>
-        <w:t xml:space="preserve"> results from the “</w:t>
-      </w:r>
-      <w:proofErr w:type="spellStart"/>
-      <w:r>
-        <w:t>varscan</w:t>
-      </w:r>
-      <w:proofErr w:type="spellEnd"/>
-      <w:r>
-        <w:t>” program for the corresponding groups.</w:t>
+        <w:t xml:space="preserve"> results from the “varscan” program for the corresponding groups.</w:t>
       </w:r>
     </w:p>
     <w:p>
@@ -537,7 +508,25 @@
           <w:sz w:val="16"/>
           <w:szCs w:val="16"/>
         </w:rPr>
-        <w:t>:1:12:4:0 C:12:2:37:1:8:4</w:t>
+        <w:t xml:space="preserve">:1:12:4:0 </w:t>
+      </w:r>
+      <w:proofErr w:type="gramStart"/>
+      <w:r>
+        <w:rPr>
+          <w:rFonts w:ascii="Consolas" w:hAnsi="Consolas"/>
+          <w:sz w:val="16"/>
+          <w:szCs w:val="16"/>
+        </w:rPr>
+        <w:t>C:12:2:37</w:t>
+      </w:r>
+      <w:proofErr w:type="gramEnd"/>
+      <w:r>
+        <w:rPr>
+          <w:rFonts w:ascii="Consolas" w:hAnsi="Consolas"/>
+          <w:sz w:val="16"/>
+          <w:szCs w:val="16"/>
+        </w:rPr>
+        <w:t>:1:8:4</w:t>
       </w:r>
     </w:p>
     <w:p>
@@ -870,15 +859,7 @@
         <w:t>to</w:t>
       </w:r>
       <w:r>
-        <w:t xml:space="preserve"> run in a desktop environment with about 16 </w:t>
-      </w:r>
-      <w:proofErr w:type="spellStart"/>
-      <w:r>
-        <w:t>gb</w:t>
-      </w:r>
-      <w:proofErr w:type="spellEnd"/>
-      <w:r>
-        <w:t xml:space="preserve"> of RAM</w:t>
+        <w:t xml:space="preserve"> run in a desktop environment with about 16 gb of RAM</w:t>
       </w:r>
       <w:r>
         <w:t>;</w:t>
@@ -886,50 +867,24 @@
       <w:r>
         <w:t xml:space="preserve"> the initial input files require some preprocessing. The read counts should be split into “three” chromosomes by the </w:t>
       </w:r>
-      <w:proofErr w:type="spellStart"/>
       <w:proofErr w:type="gramStart"/>
       <w:r>
         <w:t>splitter.r</w:t>
       </w:r>
-      <w:proofErr w:type="spellEnd"/>
-      <w:proofErr w:type="gramEnd"/>
-      <w:r>
-        <w:t xml:space="preserve"> program and the reference genome should be imported into </w:t>
-      </w:r>
-      <w:proofErr w:type="spellStart"/>
-      <w:r>
-        <w:t>sqlite</w:t>
-      </w:r>
-      <w:proofErr w:type="spellEnd"/>
-      <w:r>
-        <w:t xml:space="preserve"> database with the “</w:t>
-      </w:r>
-      <w:proofErr w:type="spellStart"/>
-      <w:r>
-        <w:t>into_sql.r</w:t>
-      </w:r>
-      <w:proofErr w:type="spellEnd"/>
+      <w:proofErr w:type="gramEnd"/>
+      <w:r>
+        <w:t xml:space="preserve"> program and the reference genome should be imported into sqlite database with the “into_</w:t>
+      </w:r>
+      <w:proofErr w:type="gramStart"/>
+      <w:r>
+        <w:t>sql.r</w:t>
+      </w:r>
+      <w:proofErr w:type="gramEnd"/>
       <w:r>
         <w:t>” script</w:t>
       </w:r>
       <w:r>
-        <w:t xml:space="preserve">. Putting the file into </w:t>
-      </w:r>
-      <w:proofErr w:type="spellStart"/>
-      <w:r>
-        <w:t>sqlite</w:t>
-      </w:r>
-      <w:proofErr w:type="spellEnd"/>
-      <w:r>
-        <w:t xml:space="preserve"> takes ~8 </w:t>
-      </w:r>
-      <w:proofErr w:type="spellStart"/>
-      <w:r>
-        <w:t>hrs</w:t>
-      </w:r>
-      <w:proofErr w:type="spellEnd"/>
-      <w:r>
-        <w:t xml:space="preserve"> but is only done once.</w:t>
+        <w:t>. Putting the file into sqlite takes ~8 hrs but is only done once.</w:t>
       </w:r>
     </w:p>
     <w:p>
@@ -982,12 +937,10 @@
       <w:r>
         <w:t xml:space="preserve"> (</w:t>
       </w:r>
-      <w:proofErr w:type="spellStart"/>
       <w:proofErr w:type="gramStart"/>
       <w:r>
         <w:t>splitter.r</w:t>
       </w:r>
-      <w:proofErr w:type="spellEnd"/>
       <w:proofErr w:type="gramEnd"/>
       <w:r>
         <w:t>)</w:t>
@@ -1059,7 +1012,25 @@
           <w:sz w:val="16"/>
           <w:szCs w:val="16"/>
         </w:rPr>
-        <w:t>list = ls())</w:t>
+        <w:t xml:space="preserve">list = </w:t>
+      </w:r>
+      <w:proofErr w:type="gramStart"/>
+      <w:r>
+        <w:rPr>
+          <w:rFonts w:ascii="Consolas" w:hAnsi="Consolas"/>
+          <w:sz w:val="16"/>
+          <w:szCs w:val="16"/>
+        </w:rPr>
+        <w:t>ls(</w:t>
+      </w:r>
+      <w:proofErr w:type="gramEnd"/>
+      <w:r>
+        <w:rPr>
+          <w:rFonts w:ascii="Consolas" w:hAnsi="Consolas"/>
+          <w:sz w:val="16"/>
+          <w:szCs w:val="16"/>
+        </w:rPr>
+        <w:t>))</w:t>
       </w:r>
     </w:p>
     <w:p>
@@ -1079,7 +1050,6 @@
         </w:rPr>
         <w:t>library(</w:t>
       </w:r>
-      <w:proofErr w:type="spellStart"/>
       <w:proofErr w:type="gramStart"/>
       <w:r>
         <w:rPr>
@@ -1089,7 +1059,6 @@
         </w:rPr>
         <w:t>data.table</w:t>
       </w:r>
-      <w:proofErr w:type="spellEnd"/>
       <w:proofErr w:type="gramEnd"/>
       <w:r>
         <w:rPr>
@@ -1173,23 +1142,13 @@
           <w:szCs w:val="16"/>
         </w:rPr>
       </w:pPr>
-      <w:proofErr w:type="spellStart"/>
-      <w:r>
-        <w:rPr>
-          <w:rFonts w:ascii="Consolas" w:hAnsi="Consolas"/>
-          <w:sz w:val="16"/>
-          <w:szCs w:val="16"/>
-        </w:rPr>
-        <w:t>filePath</w:t>
-      </w:r>
-      <w:proofErr w:type="spellEnd"/>
-      <w:r>
-        <w:rPr>
-          <w:rFonts w:ascii="Consolas" w:hAnsi="Consolas"/>
-          <w:sz w:val="16"/>
-          <w:szCs w:val="16"/>
-        </w:rPr>
-        <w:t xml:space="preserve"> &lt;- "data/input/5feb_tem_a1.readcounts"</w:t>
+      <w:r>
+        <w:rPr>
+          <w:rFonts w:ascii="Consolas" w:hAnsi="Consolas"/>
+          <w:sz w:val="16"/>
+          <w:szCs w:val="16"/>
+        </w:rPr>
+        <w:t>filePath &lt;- "data/input/5feb_tem_a1.readcounts"</w:t>
       </w:r>
     </w:p>
     <w:p>
@@ -1358,23 +1317,7 @@
         <w:spacing w:after="0" w:line="240" w:lineRule="auto"/>
       </w:pPr>
       <w:r>
-        <w:t xml:space="preserve">Set the input file in the input section and pass it to </w:t>
-      </w:r>
-      <w:proofErr w:type="spellStart"/>
-      <w:r>
-        <w:t>filePath</w:t>
-      </w:r>
-      <w:proofErr w:type="spellEnd"/>
-      <w:r>
-        <w:t xml:space="preserve">. Set the output files but </w:t>
-      </w:r>
-      <w:proofErr w:type="gramStart"/>
-      <w:r>
-        <w:t>passing</w:t>
-      </w:r>
-      <w:proofErr w:type="gramEnd"/>
-      <w:r>
-        <w:t xml:space="preserve"> the name and path to the files to the ch1File variables, etc. Hit the source button in RStudio or source it in the command line. </w:t>
+        <w:t xml:space="preserve">Set the input file in the input section and pass it to filePath. Set the output files but passing the name and path to the files to the ch1File variables, etc. Hit the source button in RStudio or source it in the command line. </w:t>
       </w:r>
     </w:p>
     <w:p>
@@ -1382,33 +1325,12 @@
         <w:pStyle w:val="Heading2"/>
       </w:pPr>
       <w:r>
-        <w:t xml:space="preserve">Genome into </w:t>
-      </w:r>
-      <w:proofErr w:type="spellStart"/>
-      <w:r>
-        <w:t>sqlite</w:t>
-      </w:r>
-      <w:proofErr w:type="spellEnd"/>
-      <w:r>
-        <w:t xml:space="preserve"> </w:t>
-      </w:r>
-      <w:proofErr w:type="spellStart"/>
-      <w:r>
-        <w:t>db</w:t>
-      </w:r>
-      <w:proofErr w:type="spellEnd"/>
-      <w:r>
-        <w:t xml:space="preserve"> (</w:t>
-      </w:r>
-      <w:proofErr w:type="spellStart"/>
-      <w:r>
-        <w:t>into_</w:t>
+        <w:t>Genome into sqlite db (into_</w:t>
       </w:r>
       <w:proofErr w:type="gramStart"/>
       <w:r>
         <w:t>sql.r</w:t>
       </w:r>
-      <w:proofErr w:type="spellEnd"/>
       <w:proofErr w:type="gramEnd"/>
       <w:r>
         <w:t>)</w:t>
@@ -1439,12 +1361,10 @@
       <w:r>
         <w:t>Finding mono and polymorphic site (</w:t>
       </w:r>
-      <w:proofErr w:type="spellStart"/>
       <w:proofErr w:type="gramStart"/>
       <w:r>
         <w:t>physmap.r</w:t>
       </w:r>
-      <w:proofErr w:type="spellEnd"/>
       <w:proofErr w:type="gramEnd"/>
       <w:r>
         <w:t>)</w:t>
@@ -1511,7 +1431,25 @@
           <w:sz w:val="16"/>
           <w:szCs w:val="16"/>
         </w:rPr>
-        <w:t>list = ls())</w:t>
+        <w:t xml:space="preserve">list = </w:t>
+      </w:r>
+      <w:proofErr w:type="gramStart"/>
+      <w:r>
+        <w:rPr>
+          <w:rFonts w:ascii="Consolas" w:hAnsi="Consolas"/>
+          <w:sz w:val="16"/>
+          <w:szCs w:val="16"/>
+        </w:rPr>
+        <w:t>ls(</w:t>
+      </w:r>
+      <w:proofErr w:type="gramEnd"/>
+      <w:r>
+        <w:rPr>
+          <w:rFonts w:ascii="Consolas" w:hAnsi="Consolas"/>
+          <w:sz w:val="16"/>
+          <w:szCs w:val="16"/>
+        </w:rPr>
+        <w:t>))</w:t>
       </w:r>
     </w:p>
     <w:p>
@@ -1542,17 +1480,43 @@
         </w:rPr>
         <w:t>library(</w:t>
       </w:r>
-      <w:proofErr w:type="spellStart"/>
-      <w:proofErr w:type="gramEnd"/>
-      <w:r>
-        <w:rPr>
-          <w:rFonts w:ascii="Consolas" w:hAnsi="Consolas"/>
-          <w:sz w:val="16"/>
-          <w:szCs w:val="16"/>
-        </w:rPr>
-        <w:t>Rcpp</w:t>
-      </w:r>
-      <w:proofErr w:type="spellEnd"/>
+      <w:proofErr w:type="gramEnd"/>
+      <w:r>
+        <w:rPr>
+          <w:rFonts w:ascii="Consolas" w:hAnsi="Consolas"/>
+          <w:sz w:val="16"/>
+          <w:szCs w:val="16"/>
+        </w:rPr>
+        <w:t>Rcpp)</w:t>
+      </w:r>
+    </w:p>
+    <w:p>
+      <w:pPr>
+        <w:pStyle w:val="NoSpacing"/>
+        <w:rPr>
+          <w:rFonts w:ascii="Consolas" w:hAnsi="Consolas"/>
+          <w:sz w:val="16"/>
+          <w:szCs w:val="16"/>
+        </w:rPr>
+      </w:pPr>
+      <w:r>
+        <w:rPr>
+          <w:rFonts w:ascii="Consolas" w:hAnsi="Consolas"/>
+          <w:sz w:val="16"/>
+          <w:szCs w:val="16"/>
+        </w:rPr>
+        <w:t>library(</w:t>
+      </w:r>
+      <w:proofErr w:type="gramStart"/>
+      <w:r>
+        <w:rPr>
+          <w:rFonts w:ascii="Consolas" w:hAnsi="Consolas"/>
+          <w:sz w:val="16"/>
+          <w:szCs w:val="16"/>
+        </w:rPr>
+        <w:t>data.table</w:t>
+      </w:r>
+      <w:proofErr w:type="gramEnd"/>
       <w:r>
         <w:rPr>
           <w:rFonts w:ascii="Consolas" w:hAnsi="Consolas"/>
@@ -1577,55 +1541,7 @@
           <w:sz w:val="16"/>
           <w:szCs w:val="16"/>
         </w:rPr>
-        <w:t>library(</w:t>
-      </w:r>
-      <w:proofErr w:type="spellStart"/>
-      <w:proofErr w:type="gramStart"/>
-      <w:r>
-        <w:rPr>
-          <w:rFonts w:ascii="Consolas" w:hAnsi="Consolas"/>
-          <w:sz w:val="16"/>
-          <w:szCs w:val="16"/>
-        </w:rPr>
-        <w:t>data.table</w:t>
-      </w:r>
-      <w:proofErr w:type="spellEnd"/>
-      <w:proofErr w:type="gramEnd"/>
-      <w:r>
-        <w:rPr>
-          <w:rFonts w:ascii="Consolas" w:hAnsi="Consolas"/>
-          <w:sz w:val="16"/>
-          <w:szCs w:val="16"/>
-        </w:rPr>
-        <w:t>)</w:t>
-      </w:r>
-    </w:p>
-    <w:p>
-      <w:pPr>
-        <w:pStyle w:val="NoSpacing"/>
-        <w:rPr>
-          <w:rFonts w:ascii="Consolas" w:hAnsi="Consolas"/>
-          <w:sz w:val="16"/>
-          <w:szCs w:val="16"/>
-        </w:rPr>
-      </w:pPr>
-      <w:proofErr w:type="spellStart"/>
-      <w:r>
-        <w:rPr>
-          <w:rFonts w:ascii="Consolas" w:hAnsi="Consolas"/>
-          <w:sz w:val="16"/>
-          <w:szCs w:val="16"/>
-        </w:rPr>
-        <w:t>sourceCpp</w:t>
-      </w:r>
-      <w:proofErr w:type="spellEnd"/>
-      <w:r>
-        <w:rPr>
-          <w:rFonts w:ascii="Consolas" w:hAnsi="Consolas"/>
-          <w:sz w:val="16"/>
-          <w:szCs w:val="16"/>
-        </w:rPr>
-        <w:t>("physmap.cpp")</w:t>
+        <w:t>sourceCpp("physmap.cpp")</w:t>
       </w:r>
     </w:p>
     <w:p>
@@ -1683,51 +1599,31 @@
           <w:szCs w:val="16"/>
         </w:rPr>
       </w:pPr>
-      <w:proofErr w:type="spellStart"/>
-      <w:r>
-        <w:rPr>
-          <w:rFonts w:ascii="Consolas" w:hAnsi="Consolas"/>
-          <w:sz w:val="16"/>
-          <w:szCs w:val="16"/>
-        </w:rPr>
-        <w:t>inputFileName</w:t>
-      </w:r>
-      <w:proofErr w:type="spellEnd"/>
-      <w:r>
-        <w:rPr>
-          <w:rFonts w:ascii="Consolas" w:hAnsi="Consolas"/>
-          <w:sz w:val="16"/>
-          <w:szCs w:val="16"/>
-        </w:rPr>
-        <w:t xml:space="preserve"> &lt;- "data/input/5feb_tem_a1_c1_rc.rds"</w:t>
-      </w:r>
-    </w:p>
-    <w:p>
-      <w:pPr>
-        <w:pStyle w:val="NoSpacing"/>
-        <w:rPr>
-          <w:rFonts w:ascii="Consolas" w:hAnsi="Consolas"/>
-          <w:sz w:val="16"/>
-          <w:szCs w:val="16"/>
-        </w:rPr>
-      </w:pPr>
-      <w:proofErr w:type="spellStart"/>
-      <w:r>
-        <w:rPr>
-          <w:rFonts w:ascii="Consolas" w:hAnsi="Consolas"/>
-          <w:sz w:val="16"/>
-          <w:szCs w:val="16"/>
-        </w:rPr>
-        <w:t>outFileName</w:t>
-      </w:r>
-      <w:proofErr w:type="spellEnd"/>
-      <w:r>
-        <w:rPr>
-          <w:rFonts w:ascii="Consolas" w:hAnsi="Consolas"/>
-          <w:sz w:val="16"/>
-          <w:szCs w:val="16"/>
-        </w:rPr>
-        <w:t xml:space="preserve">   &lt;- "data/output/5feb_tem_a1_c1.rds"</w:t>
+      <w:r>
+        <w:rPr>
+          <w:rFonts w:ascii="Consolas" w:hAnsi="Consolas"/>
+          <w:sz w:val="16"/>
+          <w:szCs w:val="16"/>
+        </w:rPr>
+        <w:t>inputFileName &lt;- "data/input/5feb_tem_a1_c1_rc.rds"</w:t>
+      </w:r>
+    </w:p>
+    <w:p>
+      <w:pPr>
+        <w:pStyle w:val="NoSpacing"/>
+        <w:rPr>
+          <w:rFonts w:ascii="Consolas" w:hAnsi="Consolas"/>
+          <w:sz w:val="16"/>
+          <w:szCs w:val="16"/>
+        </w:rPr>
+      </w:pPr>
+      <w:r>
+        <w:rPr>
+          <w:rFonts w:ascii="Consolas" w:hAnsi="Consolas"/>
+          <w:sz w:val="16"/>
+          <w:szCs w:val="16"/>
+        </w:rPr>
+        <w:t>outFileName   &lt;- "data/output/5feb_tem_a1_c1.rds"</w:t>
       </w:r>
     </w:p>
     <w:p>
@@ -1758,15 +1654,7 @@
       </w:r>
       <w:r>
         <w:lastRenderedPageBreak/>
-        <w:t>“</w:t>
-      </w:r>
-      <w:proofErr w:type="spellStart"/>
-      <w:r>
-        <w:t>physmap.ccp</w:t>
-      </w:r>
-      <w:proofErr w:type="spellEnd"/>
-      <w:r>
-        <w:t>” file, which is required</w:t>
+        <w:t>“physmap.ccp” file, which is required</w:t>
       </w:r>
       <w:r>
         <w:t>. T</w:t>
@@ -1781,15 +1669,7 @@
         <w:t>s</w:t>
       </w:r>
       <w:r>
-        <w:t xml:space="preserve"> the installation of the “BH” and “</w:t>
-      </w:r>
-      <w:proofErr w:type="spellStart"/>
-      <w:r>
-        <w:t>Rcpp</w:t>
-      </w:r>
-      <w:proofErr w:type="spellEnd"/>
-      <w:r>
-        <w:t>” libraries. Depending on how R was setup</w:t>
+        <w:t xml:space="preserve"> the installation of the “BH” and “Rcpp” libraries. Depending on how R was setup</w:t>
       </w:r>
       <w:r>
         <w:t>,</w:t>
@@ -1804,19 +1684,11 @@
         <w:t xml:space="preserve">the installation of the </w:t>
       </w:r>
       <w:hyperlink r:id="rId5" w:history="1">
-        <w:proofErr w:type="spellStart"/>
         <w:r>
           <w:rPr>
             <w:rStyle w:val="Hyperlink"/>
           </w:rPr>
-          <w:t>RTools</w:t>
-        </w:r>
-        <w:proofErr w:type="spellEnd"/>
-        <w:r>
-          <w:rPr>
-            <w:rStyle w:val="Hyperlink"/>
-          </w:rPr>
-          <w:t xml:space="preserve"> package</w:t>
+          <w:t>RTools package</w:t>
         </w:r>
       </w:hyperlink>
       <w:r>
@@ -1854,96 +1726,32 @@
         </w:rPr>
         <w:t>head(</w:t>
       </w:r>
-      <w:proofErr w:type="spellStart"/>
-      <w:proofErr w:type="gramEnd"/>
-      <w:r>
-        <w:rPr>
-          <w:rFonts w:ascii="Consolas" w:hAnsi="Consolas"/>
-          <w:sz w:val="16"/>
-          <w:szCs w:val="16"/>
-        </w:rPr>
-        <w:t>rawData</w:t>
-      </w:r>
-      <w:proofErr w:type="spellEnd"/>
-      <w:r>
-        <w:rPr>
-          <w:rFonts w:ascii="Consolas" w:hAnsi="Consolas"/>
-          <w:sz w:val="16"/>
-          <w:szCs w:val="16"/>
-        </w:rPr>
-        <w:t>, n = 10)</w:t>
-      </w:r>
-    </w:p>
-    <w:p>
-      <w:pPr>
-        <w:pStyle w:val="NoSpacing"/>
-        <w:rPr>
-          <w:rFonts w:ascii="Consolas" w:hAnsi="Consolas"/>
-          <w:sz w:val="16"/>
-          <w:szCs w:val="16"/>
-        </w:rPr>
-      </w:pPr>
-      <w:r>
-        <w:rPr>
-          <w:rFonts w:ascii="Consolas" w:hAnsi="Consolas"/>
-          <w:sz w:val="16"/>
-          <w:szCs w:val="16"/>
-        </w:rPr>
-        <w:t xml:space="preserve">   </w:t>
-      </w:r>
-      <w:proofErr w:type="spellStart"/>
-      <w:r>
-        <w:rPr>
-          <w:rFonts w:ascii="Consolas" w:hAnsi="Consolas"/>
-          <w:sz w:val="16"/>
-          <w:szCs w:val="16"/>
-        </w:rPr>
-        <w:t>chrom</w:t>
-      </w:r>
-      <w:proofErr w:type="spellEnd"/>
-      <w:r>
-        <w:rPr>
-          <w:rFonts w:ascii="Consolas" w:hAnsi="Consolas"/>
-          <w:sz w:val="16"/>
-          <w:szCs w:val="16"/>
-        </w:rPr>
-        <w:t xml:space="preserve"> position </w:t>
-      </w:r>
-      <w:proofErr w:type="spellStart"/>
-      <w:r>
-        <w:rPr>
-          <w:rFonts w:ascii="Consolas" w:hAnsi="Consolas"/>
-          <w:sz w:val="16"/>
-          <w:szCs w:val="16"/>
-        </w:rPr>
-        <w:t>refnuc</w:t>
-      </w:r>
-      <w:proofErr w:type="spellEnd"/>
-      <w:r>
-        <w:rPr>
-          <w:rFonts w:ascii="Consolas" w:hAnsi="Consolas"/>
-          <w:sz w:val="16"/>
-          <w:szCs w:val="16"/>
-        </w:rPr>
-        <w:t xml:space="preserve"> depth q30_depth              </w:t>
-      </w:r>
-      <w:proofErr w:type="spellStart"/>
-      <w:r>
-        <w:rPr>
-          <w:rFonts w:ascii="Consolas" w:hAnsi="Consolas"/>
-          <w:sz w:val="16"/>
-          <w:szCs w:val="16"/>
-        </w:rPr>
-        <w:t>refQA</w:t>
-      </w:r>
-      <w:proofErr w:type="spellEnd"/>
-      <w:r>
-        <w:rPr>
-          <w:rFonts w:ascii="Consolas" w:hAnsi="Consolas"/>
-          <w:sz w:val="16"/>
-          <w:szCs w:val="16"/>
-        </w:rPr>
-        <w:t xml:space="preserve">            snp1 snp2 snp3</w:t>
+      <w:proofErr w:type="gramEnd"/>
+      <w:r>
+        <w:rPr>
+          <w:rFonts w:ascii="Consolas" w:hAnsi="Consolas"/>
+          <w:sz w:val="16"/>
+          <w:szCs w:val="16"/>
+        </w:rPr>
+        <w:t>rawData, n = 10)</w:t>
+      </w:r>
+    </w:p>
+    <w:p>
+      <w:pPr>
+        <w:pStyle w:val="NoSpacing"/>
+        <w:rPr>
+          <w:rFonts w:ascii="Consolas" w:hAnsi="Consolas"/>
+          <w:sz w:val="16"/>
+          <w:szCs w:val="16"/>
+        </w:rPr>
+      </w:pPr>
+      <w:r>
+        <w:rPr>
+          <w:rFonts w:ascii="Consolas" w:hAnsi="Consolas"/>
+          <w:sz w:val="16"/>
+          <w:szCs w:val="16"/>
+        </w:rPr>
+        <w:t xml:space="preserve">   chrom position refnuc depth q30_depth              refQA            snp1 snp2 snp3</w:t>
       </w:r>
       <w:r>
         <w:rPr>
@@ -2203,7 +2011,25 @@
           <w:sz w:val="16"/>
           <w:szCs w:val="16"/>
         </w:rPr>
-        <w:t xml:space="preserve">:1:12:4:0 C:12:2:37:1:8:4          </w:t>
+        <w:t xml:space="preserve">:1:12:4:0 </w:t>
+      </w:r>
+      <w:proofErr w:type="gramStart"/>
+      <w:r>
+        <w:rPr>
+          <w:rFonts w:ascii="Consolas" w:hAnsi="Consolas"/>
+          <w:sz w:val="16"/>
+          <w:szCs w:val="16"/>
+        </w:rPr>
+        <w:t>C:12:2:37</w:t>
+      </w:r>
+      <w:proofErr w:type="gramEnd"/>
+      <w:r>
+        <w:rPr>
+          <w:rFonts w:ascii="Consolas" w:hAnsi="Consolas"/>
+          <w:sz w:val="16"/>
+          <w:szCs w:val="16"/>
+        </w:rPr>
+        <w:t xml:space="preserve">:1:8:4          </w:t>
       </w:r>
     </w:p>
     <w:p>
@@ -2346,7 +2172,6 @@
         </w:rPr>
         <w:t>head(</w:t>
       </w:r>
-      <w:proofErr w:type="spellStart"/>
       <w:proofErr w:type="gramEnd"/>
       <w:r>
         <w:rPr>
@@ -2356,7 +2181,6 @@
         </w:rPr>
         <w:t>dtChrom</w:t>
       </w:r>
-      <w:proofErr w:type="spellEnd"/>
       <w:r>
         <w:rPr>
           <w:rFonts w:ascii="Consolas" w:hAnsi="Consolas"/>
@@ -2391,44 +2215,78 @@
         </w:rPr>
         <w:t xml:space="preserve">   </w:t>
       </w:r>
-      <w:proofErr w:type="spellStart"/>
-      <w:proofErr w:type="gramStart"/>
-      <w:r>
-        <w:rPr>
-          <w:rFonts w:ascii="Consolas" w:hAnsi="Consolas"/>
-          <w:sz w:val="16"/>
-          <w:szCs w:val="16"/>
-        </w:rPr>
-        <w:t>chrom</w:t>
-      </w:r>
-      <w:proofErr w:type="spellEnd"/>
-      <w:r>
-        <w:rPr>
-          <w:rFonts w:ascii="Consolas" w:hAnsi="Consolas"/>
-          <w:sz w:val="16"/>
-          <w:szCs w:val="16"/>
-        </w:rPr>
-        <w:t xml:space="preserve">  pos</w:t>
-      </w:r>
-      <w:proofErr w:type="gramEnd"/>
-      <w:r>
-        <w:rPr>
-          <w:rFonts w:ascii="Consolas" w:hAnsi="Consolas"/>
-          <w:sz w:val="16"/>
-          <w:szCs w:val="16"/>
-        </w:rPr>
-        <w:t xml:space="preserve"> ref  a  c  g  t  i d </w:t>
-      </w:r>
-      <w:proofErr w:type="spellStart"/>
-      <w:r>
-        <w:rPr>
-          <w:rFonts w:ascii="Consolas" w:hAnsi="Consolas"/>
-          <w:sz w:val="16"/>
-          <w:szCs w:val="16"/>
-        </w:rPr>
-        <w:t>sumDepth</w:t>
-      </w:r>
-      <w:proofErr w:type="spellEnd"/>
+      <w:proofErr w:type="gramStart"/>
+      <w:r>
+        <w:rPr>
+          <w:rFonts w:ascii="Consolas" w:hAnsi="Consolas"/>
+          <w:sz w:val="16"/>
+          <w:szCs w:val="16"/>
+        </w:rPr>
+        <w:t>chrom  pos</w:t>
+      </w:r>
+      <w:proofErr w:type="gramEnd"/>
+      <w:r>
+        <w:rPr>
+          <w:rFonts w:ascii="Consolas" w:hAnsi="Consolas"/>
+          <w:sz w:val="16"/>
+          <w:szCs w:val="16"/>
+        </w:rPr>
+        <w:t xml:space="preserve"> </w:t>
+      </w:r>
+      <w:proofErr w:type="gramStart"/>
+      <w:r>
+        <w:rPr>
+          <w:rFonts w:ascii="Consolas" w:hAnsi="Consolas"/>
+          <w:sz w:val="16"/>
+          <w:szCs w:val="16"/>
+        </w:rPr>
+        <w:t>ref  a</w:t>
+      </w:r>
+      <w:proofErr w:type="gramEnd"/>
+      <w:r>
+        <w:rPr>
+          <w:rFonts w:ascii="Consolas" w:hAnsi="Consolas"/>
+          <w:sz w:val="16"/>
+          <w:szCs w:val="16"/>
+        </w:rPr>
+        <w:t xml:space="preserve">  </w:t>
+      </w:r>
+      <w:proofErr w:type="gramStart"/>
+      <w:r>
+        <w:rPr>
+          <w:rFonts w:ascii="Consolas" w:hAnsi="Consolas"/>
+          <w:sz w:val="16"/>
+          <w:szCs w:val="16"/>
+        </w:rPr>
+        <w:t>c  g</w:t>
+      </w:r>
+      <w:proofErr w:type="gramEnd"/>
+      <w:r>
+        <w:rPr>
+          <w:rFonts w:ascii="Consolas" w:hAnsi="Consolas"/>
+          <w:sz w:val="16"/>
+          <w:szCs w:val="16"/>
+        </w:rPr>
+        <w:t xml:space="preserve">  </w:t>
+      </w:r>
+      <w:proofErr w:type="gramStart"/>
+      <w:r>
+        <w:rPr>
+          <w:rFonts w:ascii="Consolas" w:hAnsi="Consolas"/>
+          <w:sz w:val="16"/>
+          <w:szCs w:val="16"/>
+        </w:rPr>
+        <w:t>t  i</w:t>
+      </w:r>
+      <w:proofErr w:type="gramEnd"/>
+      <w:r>
+        <w:rPr>
+          <w:rFonts w:ascii="Consolas" w:hAnsi="Consolas"/>
+          <w:sz w:val="16"/>
+          <w:szCs w:val="16"/>
+        </w:rPr>
+        <w:t xml:space="preserve"> d sumDepth</w:t>
+      </w:r>
     </w:p>
     <w:p>
       <w:pPr>
@@ -2463,7 +2321,25 @@
           <w:sz w:val="16"/>
           <w:szCs w:val="16"/>
         </w:rPr>
-        <w:t xml:space="preserve"> 12 16  0  0 0       28</w:t>
+        <w:t xml:space="preserve"> 12 </w:t>
+      </w:r>
+      <w:proofErr w:type="gramStart"/>
+      <w:r>
+        <w:rPr>
+          <w:rFonts w:ascii="Consolas" w:hAnsi="Consolas"/>
+          <w:sz w:val="16"/>
+          <w:szCs w:val="16"/>
+        </w:rPr>
+        <w:t>16  0</w:t>
+      </w:r>
+      <w:proofErr w:type="gramEnd"/>
+      <w:r>
+        <w:rPr>
+          <w:rFonts w:ascii="Consolas" w:hAnsi="Consolas"/>
+          <w:sz w:val="16"/>
+          <w:szCs w:val="16"/>
+        </w:rPr>
+        <w:t xml:space="preserve">  0 0       28</w:t>
       </w:r>
     </w:p>
     <w:p>
@@ -2499,7 +2375,25 @@
           <w:sz w:val="16"/>
           <w:szCs w:val="16"/>
         </w:rPr>
-        <w:t xml:space="preserve">  0 10 61  0 0       71</w:t>
+        <w:t xml:space="preserve">  0 10 </w:t>
+      </w:r>
+      <w:proofErr w:type="gramStart"/>
+      <w:r>
+        <w:rPr>
+          <w:rFonts w:ascii="Consolas" w:hAnsi="Consolas"/>
+          <w:sz w:val="16"/>
+          <w:szCs w:val="16"/>
+        </w:rPr>
+        <w:t>61  0</w:t>
+      </w:r>
+      <w:proofErr w:type="gramEnd"/>
+      <w:r>
+        <w:rPr>
+          <w:rFonts w:ascii="Consolas" w:hAnsi="Consolas"/>
+          <w:sz w:val="16"/>
+          <w:szCs w:val="16"/>
+        </w:rPr>
+        <w:t xml:space="preserve"> 0       71</w:t>
       </w:r>
     </w:p>
     <w:p>
@@ -2535,7 +2429,25 @@
           <w:sz w:val="16"/>
           <w:szCs w:val="16"/>
         </w:rPr>
-        <w:t xml:space="preserve">  0 62 12  0 0       74</w:t>
+        <w:t xml:space="preserve">  0 62 </w:t>
+      </w:r>
+      <w:proofErr w:type="gramStart"/>
+      <w:r>
+        <w:rPr>
+          <w:rFonts w:ascii="Consolas" w:hAnsi="Consolas"/>
+          <w:sz w:val="16"/>
+          <w:szCs w:val="16"/>
+        </w:rPr>
+        <w:t>12  0</w:t>
+      </w:r>
+      <w:proofErr w:type="gramEnd"/>
+      <w:r>
+        <w:rPr>
+          <w:rFonts w:ascii="Consolas" w:hAnsi="Consolas"/>
+          <w:sz w:val="16"/>
+          <w:szCs w:val="16"/>
+        </w:rPr>
+        <w:t xml:space="preserve"> 0       74</w:t>
       </w:r>
     </w:p>
     <w:p>
@@ -2571,7 +2483,25 @@
           <w:sz w:val="16"/>
           <w:szCs w:val="16"/>
         </w:rPr>
-        <w:t xml:space="preserve"> 11  0  0 0       78</w:t>
+        <w:t xml:space="preserve"> </w:t>
+      </w:r>
+      <w:proofErr w:type="gramStart"/>
+      <w:r>
+        <w:rPr>
+          <w:rFonts w:ascii="Consolas" w:hAnsi="Consolas"/>
+          <w:sz w:val="16"/>
+          <w:szCs w:val="16"/>
+        </w:rPr>
+        <w:t>11  0</w:t>
+      </w:r>
+      <w:proofErr w:type="gramEnd"/>
+      <w:r>
+        <w:rPr>
+          <w:rFonts w:ascii="Consolas" w:hAnsi="Consolas"/>
+          <w:sz w:val="16"/>
+          <w:szCs w:val="16"/>
+        </w:rPr>
+        <w:t xml:space="preserve">  0 0       78</w:t>
       </w:r>
     </w:p>
     <w:p>
@@ -2607,7 +2537,25 @@
           <w:sz w:val="16"/>
           <w:szCs w:val="16"/>
         </w:rPr>
-        <w:t xml:space="preserve"> 74  0  0 0       85</w:t>
+        <w:t xml:space="preserve"> </w:t>
+      </w:r>
+      <w:proofErr w:type="gramStart"/>
+      <w:r>
+        <w:rPr>
+          <w:rFonts w:ascii="Consolas" w:hAnsi="Consolas"/>
+          <w:sz w:val="16"/>
+          <w:szCs w:val="16"/>
+        </w:rPr>
+        <w:t>74  0</w:t>
+      </w:r>
+      <w:proofErr w:type="gramEnd"/>
+      <w:r>
+        <w:rPr>
+          <w:rFonts w:ascii="Consolas" w:hAnsi="Consolas"/>
+          <w:sz w:val="16"/>
+          <w:szCs w:val="16"/>
+        </w:rPr>
+        <w:t xml:space="preserve">  0 0       85</w:t>
       </w:r>
     </w:p>
     <w:p>
@@ -2643,7 +2591,25 @@
           <w:sz w:val="16"/>
           <w:szCs w:val="16"/>
         </w:rPr>
-        <w:t xml:space="preserve"> 78  0  0 10 0       88</w:t>
+        <w:t xml:space="preserve"> </w:t>
+      </w:r>
+      <w:proofErr w:type="gramStart"/>
+      <w:r>
+        <w:rPr>
+          <w:rFonts w:ascii="Consolas" w:hAnsi="Consolas"/>
+          <w:sz w:val="16"/>
+          <w:szCs w:val="16"/>
+        </w:rPr>
+        <w:t>78  0</w:t>
+      </w:r>
+      <w:proofErr w:type="gramEnd"/>
+      <w:r>
+        <w:rPr>
+          <w:rFonts w:ascii="Consolas" w:hAnsi="Consolas"/>
+          <w:sz w:val="16"/>
+          <w:szCs w:val="16"/>
+        </w:rPr>
+        <w:t xml:space="preserve">  0 10 0       88</w:t>
       </w:r>
     </w:p>
     <w:p>
@@ -2719,7 +2685,6 @@
         </w:rPr>
         <w:t>head(</w:t>
       </w:r>
-      <w:proofErr w:type="spellStart"/>
       <w:proofErr w:type="gramEnd"/>
       <w:r>
         <w:rPr>
@@ -2729,7 +2694,6 @@
         </w:rPr>
         <w:t>dtChrom</w:t>
       </w:r>
-      <w:proofErr w:type="spellEnd"/>
       <w:r>
         <w:rPr>
           <w:rFonts w:ascii="Consolas" w:hAnsi="Consolas"/>
@@ -2764,44 +2728,78 @@
         </w:rPr>
         <w:t xml:space="preserve">   </w:t>
       </w:r>
-      <w:proofErr w:type="spellStart"/>
-      <w:proofErr w:type="gramStart"/>
-      <w:r>
-        <w:rPr>
-          <w:rFonts w:ascii="Consolas" w:hAnsi="Consolas"/>
-          <w:sz w:val="16"/>
-          <w:szCs w:val="16"/>
-        </w:rPr>
-        <w:t>chrom</w:t>
-      </w:r>
-      <w:proofErr w:type="spellEnd"/>
-      <w:r>
-        <w:rPr>
-          <w:rFonts w:ascii="Consolas" w:hAnsi="Consolas"/>
-          <w:sz w:val="16"/>
-          <w:szCs w:val="16"/>
-        </w:rPr>
-        <w:t xml:space="preserve">  pos</w:t>
-      </w:r>
-      <w:proofErr w:type="gramEnd"/>
-      <w:r>
-        <w:rPr>
-          <w:rFonts w:ascii="Consolas" w:hAnsi="Consolas"/>
-          <w:sz w:val="16"/>
-          <w:szCs w:val="16"/>
-        </w:rPr>
-        <w:t xml:space="preserve"> ref  a  c  g  t  i d </w:t>
-      </w:r>
-      <w:proofErr w:type="spellStart"/>
-      <w:r>
-        <w:rPr>
-          <w:rFonts w:ascii="Consolas" w:hAnsi="Consolas"/>
-          <w:sz w:val="16"/>
-          <w:szCs w:val="16"/>
-        </w:rPr>
-        <w:t>sumDepth</w:t>
-      </w:r>
-      <w:proofErr w:type="spellEnd"/>
+      <w:proofErr w:type="gramStart"/>
+      <w:r>
+        <w:rPr>
+          <w:rFonts w:ascii="Consolas" w:hAnsi="Consolas"/>
+          <w:sz w:val="16"/>
+          <w:szCs w:val="16"/>
+        </w:rPr>
+        <w:t>chrom  pos</w:t>
+      </w:r>
+      <w:proofErr w:type="gramEnd"/>
+      <w:r>
+        <w:rPr>
+          <w:rFonts w:ascii="Consolas" w:hAnsi="Consolas"/>
+          <w:sz w:val="16"/>
+          <w:szCs w:val="16"/>
+        </w:rPr>
+        <w:t xml:space="preserve"> </w:t>
+      </w:r>
+      <w:proofErr w:type="gramStart"/>
+      <w:r>
+        <w:rPr>
+          <w:rFonts w:ascii="Consolas" w:hAnsi="Consolas"/>
+          <w:sz w:val="16"/>
+          <w:szCs w:val="16"/>
+        </w:rPr>
+        <w:t>ref  a</w:t>
+      </w:r>
+      <w:proofErr w:type="gramEnd"/>
+      <w:r>
+        <w:rPr>
+          <w:rFonts w:ascii="Consolas" w:hAnsi="Consolas"/>
+          <w:sz w:val="16"/>
+          <w:szCs w:val="16"/>
+        </w:rPr>
+        <w:t xml:space="preserve">  </w:t>
+      </w:r>
+      <w:proofErr w:type="gramStart"/>
+      <w:r>
+        <w:rPr>
+          <w:rFonts w:ascii="Consolas" w:hAnsi="Consolas"/>
+          <w:sz w:val="16"/>
+          <w:szCs w:val="16"/>
+        </w:rPr>
+        <w:t>c  g</w:t>
+      </w:r>
+      <w:proofErr w:type="gramEnd"/>
+      <w:r>
+        <w:rPr>
+          <w:rFonts w:ascii="Consolas" w:hAnsi="Consolas"/>
+          <w:sz w:val="16"/>
+          <w:szCs w:val="16"/>
+        </w:rPr>
+        <w:t xml:space="preserve">  </w:t>
+      </w:r>
+      <w:proofErr w:type="gramStart"/>
+      <w:r>
+        <w:rPr>
+          <w:rFonts w:ascii="Consolas" w:hAnsi="Consolas"/>
+          <w:sz w:val="16"/>
+          <w:szCs w:val="16"/>
+        </w:rPr>
+        <w:t>t  i</w:t>
+      </w:r>
+      <w:proofErr w:type="gramEnd"/>
+      <w:r>
+        <w:rPr>
+          <w:rFonts w:ascii="Consolas" w:hAnsi="Consolas"/>
+          <w:sz w:val="16"/>
+          <w:szCs w:val="16"/>
+        </w:rPr>
+        <w:t xml:space="preserve"> d sumDepth</w:t>
+      </w:r>
     </w:p>
     <w:p>
       <w:pPr>
@@ -2836,7 +2834,25 @@
           <w:sz w:val="16"/>
           <w:szCs w:val="16"/>
         </w:rPr>
-        <w:t xml:space="preserve"> 12 16  0  0 0       28</w:t>
+        <w:t xml:space="preserve"> 12 </w:t>
+      </w:r>
+      <w:proofErr w:type="gramStart"/>
+      <w:r>
+        <w:rPr>
+          <w:rFonts w:ascii="Consolas" w:hAnsi="Consolas"/>
+          <w:sz w:val="16"/>
+          <w:szCs w:val="16"/>
+        </w:rPr>
+        <w:t>16  0</w:t>
+      </w:r>
+      <w:proofErr w:type="gramEnd"/>
+      <w:r>
+        <w:rPr>
+          <w:rFonts w:ascii="Consolas" w:hAnsi="Consolas"/>
+          <w:sz w:val="16"/>
+          <w:szCs w:val="16"/>
+        </w:rPr>
+        <w:t xml:space="preserve">  0 0       28</w:t>
       </w:r>
     </w:p>
     <w:p>
@@ -2872,7 +2888,25 @@
           <w:sz w:val="16"/>
           <w:szCs w:val="16"/>
         </w:rPr>
-        <w:t xml:space="preserve">  0 10 61  0 0       71</w:t>
+        <w:t xml:space="preserve">  0 10 </w:t>
+      </w:r>
+      <w:proofErr w:type="gramStart"/>
+      <w:r>
+        <w:rPr>
+          <w:rFonts w:ascii="Consolas" w:hAnsi="Consolas"/>
+          <w:sz w:val="16"/>
+          <w:szCs w:val="16"/>
+        </w:rPr>
+        <w:t>61  0</w:t>
+      </w:r>
+      <w:proofErr w:type="gramEnd"/>
+      <w:r>
+        <w:rPr>
+          <w:rFonts w:ascii="Consolas" w:hAnsi="Consolas"/>
+          <w:sz w:val="16"/>
+          <w:szCs w:val="16"/>
+        </w:rPr>
+        <w:t xml:space="preserve"> 0       71</w:t>
       </w:r>
     </w:p>
     <w:p>
@@ -2908,7 +2942,25 @@
           <w:sz w:val="16"/>
           <w:szCs w:val="16"/>
         </w:rPr>
-        <w:t xml:space="preserve">  0 62 12  0 0       74</w:t>
+        <w:t xml:space="preserve">  0 62 </w:t>
+      </w:r>
+      <w:proofErr w:type="gramStart"/>
+      <w:r>
+        <w:rPr>
+          <w:rFonts w:ascii="Consolas" w:hAnsi="Consolas"/>
+          <w:sz w:val="16"/>
+          <w:szCs w:val="16"/>
+        </w:rPr>
+        <w:t>12  0</w:t>
+      </w:r>
+      <w:proofErr w:type="gramEnd"/>
+      <w:r>
+        <w:rPr>
+          <w:rFonts w:ascii="Consolas" w:hAnsi="Consolas"/>
+          <w:sz w:val="16"/>
+          <w:szCs w:val="16"/>
+        </w:rPr>
+        <w:t xml:space="preserve"> 0       74</w:t>
       </w:r>
     </w:p>
     <w:p>
@@ -2944,7 +2996,25 @@
           <w:sz w:val="16"/>
           <w:szCs w:val="16"/>
         </w:rPr>
-        <w:t xml:space="preserve"> 11  0  0 0       78</w:t>
+        <w:t xml:space="preserve"> </w:t>
+      </w:r>
+      <w:proofErr w:type="gramStart"/>
+      <w:r>
+        <w:rPr>
+          <w:rFonts w:ascii="Consolas" w:hAnsi="Consolas"/>
+          <w:sz w:val="16"/>
+          <w:szCs w:val="16"/>
+        </w:rPr>
+        <w:t>11  0</w:t>
+      </w:r>
+      <w:proofErr w:type="gramEnd"/>
+      <w:r>
+        <w:rPr>
+          <w:rFonts w:ascii="Consolas" w:hAnsi="Consolas"/>
+          <w:sz w:val="16"/>
+          <w:szCs w:val="16"/>
+        </w:rPr>
+        <w:t xml:space="preserve">  0 0       78</w:t>
       </w:r>
     </w:p>
     <w:p>
@@ -2980,7 +3050,25 @@
           <w:sz w:val="16"/>
           <w:szCs w:val="16"/>
         </w:rPr>
-        <w:t xml:space="preserve"> 74  0  0 0       85</w:t>
+        <w:t xml:space="preserve"> </w:t>
+      </w:r>
+      <w:proofErr w:type="gramStart"/>
+      <w:r>
+        <w:rPr>
+          <w:rFonts w:ascii="Consolas" w:hAnsi="Consolas"/>
+          <w:sz w:val="16"/>
+          <w:szCs w:val="16"/>
+        </w:rPr>
+        <w:t>74  0</w:t>
+      </w:r>
+      <w:proofErr w:type="gramEnd"/>
+      <w:r>
+        <w:rPr>
+          <w:rFonts w:ascii="Consolas" w:hAnsi="Consolas"/>
+          <w:sz w:val="16"/>
+          <w:szCs w:val="16"/>
+        </w:rPr>
+        <w:t xml:space="preserve">  0 0       85</w:t>
       </w:r>
     </w:p>
     <w:p>
@@ -3016,7 +3104,25 @@
           <w:sz w:val="16"/>
           <w:szCs w:val="16"/>
         </w:rPr>
-        <w:t xml:space="preserve"> 78  0  0 10 0       88</w:t>
+        <w:t xml:space="preserve"> </w:t>
+      </w:r>
+      <w:proofErr w:type="gramStart"/>
+      <w:r>
+        <w:rPr>
+          <w:rFonts w:ascii="Consolas" w:hAnsi="Consolas"/>
+          <w:sz w:val="16"/>
+          <w:szCs w:val="16"/>
+        </w:rPr>
+        <w:t>78  0</w:t>
+      </w:r>
+      <w:proofErr w:type="gramEnd"/>
+      <w:r>
+        <w:rPr>
+          <w:rFonts w:ascii="Consolas" w:hAnsi="Consolas"/>
+          <w:sz w:val="16"/>
+          <w:szCs w:val="16"/>
+        </w:rPr>
+        <w:t xml:space="preserve">  0 10 0       88</w:t>
       </w:r>
     </w:p>
     <w:p>
@@ -3042,23 +3148,7 @@
         <w:spacing w:after="0" w:line="240" w:lineRule="auto"/>
       </w:pPr>
       <w:r>
-        <w:t>Two files one *.</w:t>
-      </w:r>
-      <w:proofErr w:type="spellStart"/>
-      <w:r>
-        <w:t>rds</w:t>
-      </w:r>
-      <w:proofErr w:type="spellEnd"/>
-      <w:r>
-        <w:t xml:space="preserve"> and one *.txt; both with the same data but different formatting. The *.</w:t>
-      </w:r>
-      <w:proofErr w:type="spellStart"/>
-      <w:r>
-        <w:t>tbl</w:t>
-      </w:r>
-      <w:proofErr w:type="spellEnd"/>
-      <w:r>
-        <w:t xml:space="preserve"> was created for use with WCB4’s Fortran code. </w:t>
+        <w:t xml:space="preserve">Two files one *.rds and one *.txt; both with the same data but different formatting. The *.tbl was created for use with WCB4’s Fortran code. </w:t>
       </w:r>
     </w:p>
     <w:p>
@@ -3090,16 +3180,16 @@
           <w:sz w:val="16"/>
           <w:szCs w:val="16"/>
         </w:rPr>
-        <w:t>head(</w:t>
-      </w:r>
-      <w:proofErr w:type="gramEnd"/>
-      <w:r>
-        <w:rPr>
-          <w:rFonts w:ascii="Consolas" w:hAnsi="Consolas"/>
-          <w:sz w:val="16"/>
-          <w:szCs w:val="16"/>
-        </w:rPr>
-        <w:t>pol, n=</w:t>
+        <w:t>head(pol</w:t>
+      </w:r>
+      <w:proofErr w:type="gramEnd"/>
+      <w:r>
+        <w:rPr>
+          <w:rFonts w:ascii="Consolas" w:hAnsi="Consolas"/>
+          <w:sz w:val="16"/>
+          <w:szCs w:val="16"/>
+        </w:rPr>
+        <w:t>, n=</w:t>
       </w:r>
       <w:r>
         <w:rPr>
@@ -3193,7 +3283,61 @@
           <w:sz w:val="16"/>
           <w:szCs w:val="16"/>
         </w:rPr>
-        <w:t xml:space="preserve">  0 52  0  0  0        52      1    G  0  0 49</w:t>
+        <w:t xml:space="preserve">  0 </w:t>
+      </w:r>
+      <w:proofErr w:type="gramStart"/>
+      <w:r>
+        <w:rPr>
+          <w:rFonts w:ascii="Consolas" w:hAnsi="Consolas"/>
+          <w:sz w:val="16"/>
+          <w:szCs w:val="16"/>
+        </w:rPr>
+        <w:t>52  0</w:t>
+      </w:r>
+      <w:proofErr w:type="gramEnd"/>
+      <w:r>
+        <w:rPr>
+          <w:rFonts w:ascii="Consolas" w:hAnsi="Consolas"/>
+          <w:sz w:val="16"/>
+          <w:szCs w:val="16"/>
+        </w:rPr>
+        <w:t xml:space="preserve">  </w:t>
+      </w:r>
+      <w:proofErr w:type="gramStart"/>
+      <w:r>
+        <w:rPr>
+          <w:rFonts w:ascii="Consolas" w:hAnsi="Consolas"/>
+          <w:sz w:val="16"/>
+          <w:szCs w:val="16"/>
+        </w:rPr>
+        <w:t>0  0</w:t>
+      </w:r>
+      <w:proofErr w:type="gramEnd"/>
+      <w:r>
+        <w:rPr>
+          <w:rFonts w:ascii="Consolas" w:hAnsi="Consolas"/>
+          <w:sz w:val="16"/>
+          <w:szCs w:val="16"/>
+        </w:rPr>
+        <w:t xml:space="preserve">        52      1    </w:t>
+      </w:r>
+      <w:proofErr w:type="gramStart"/>
+      <w:r>
+        <w:rPr>
+          <w:rFonts w:ascii="Consolas" w:hAnsi="Consolas"/>
+          <w:sz w:val="16"/>
+          <w:szCs w:val="16"/>
+        </w:rPr>
+        <w:t>G  0</w:t>
+      </w:r>
+      <w:proofErr w:type="gramEnd"/>
+      <w:r>
+        <w:rPr>
+          <w:rFonts w:ascii="Consolas" w:hAnsi="Consolas"/>
+          <w:sz w:val="16"/>
+          <w:szCs w:val="16"/>
+        </w:rPr>
+        <w:t xml:space="preserve">  0 49</w:t>
       </w:r>
     </w:p>
     <w:p>
@@ -3229,7 +3373,61 @@
           <w:sz w:val="16"/>
           <w:szCs w:val="16"/>
         </w:rPr>
-        <w:t xml:space="preserve">  0  0  0  0        64      1    A 59  0  1</w:t>
+        <w:t xml:space="preserve">  </w:t>
+      </w:r>
+      <w:proofErr w:type="gramStart"/>
+      <w:r>
+        <w:rPr>
+          <w:rFonts w:ascii="Consolas" w:hAnsi="Consolas"/>
+          <w:sz w:val="16"/>
+          <w:szCs w:val="16"/>
+        </w:rPr>
+        <w:t>0  0</w:t>
+      </w:r>
+      <w:proofErr w:type="gramEnd"/>
+      <w:r>
+        <w:rPr>
+          <w:rFonts w:ascii="Consolas" w:hAnsi="Consolas"/>
+          <w:sz w:val="16"/>
+          <w:szCs w:val="16"/>
+        </w:rPr>
+        <w:t xml:space="preserve">  </w:t>
+      </w:r>
+      <w:proofErr w:type="gramStart"/>
+      <w:r>
+        <w:rPr>
+          <w:rFonts w:ascii="Consolas" w:hAnsi="Consolas"/>
+          <w:sz w:val="16"/>
+          <w:szCs w:val="16"/>
+        </w:rPr>
+        <w:t>0  0</w:t>
+      </w:r>
+      <w:proofErr w:type="gramEnd"/>
+      <w:r>
+        <w:rPr>
+          <w:rFonts w:ascii="Consolas" w:hAnsi="Consolas"/>
+          <w:sz w:val="16"/>
+          <w:szCs w:val="16"/>
+        </w:rPr>
+        <w:t xml:space="preserve">        64      1    A </w:t>
+      </w:r>
+      <w:proofErr w:type="gramStart"/>
+      <w:r>
+        <w:rPr>
+          <w:rFonts w:ascii="Consolas" w:hAnsi="Consolas"/>
+          <w:sz w:val="16"/>
+          <w:szCs w:val="16"/>
+        </w:rPr>
+        <w:t>59  0</w:t>
+      </w:r>
+      <w:proofErr w:type="gramEnd"/>
+      <w:r>
+        <w:rPr>
+          <w:rFonts w:ascii="Consolas" w:hAnsi="Consolas"/>
+          <w:sz w:val="16"/>
+          <w:szCs w:val="16"/>
+        </w:rPr>
+        <w:t xml:space="preserve">  1</w:t>
       </w:r>
     </w:p>
     <w:p>
@@ -3265,8 +3463,54 @@
           <w:sz w:val="16"/>
           <w:szCs w:val="16"/>
         </w:rPr>
-        <w:t xml:space="preserve">  0 10 61  0  0        71      1    T  0  0  3</w:t>
-      </w:r>
+        <w:t xml:space="preserve">  0 10 </w:t>
+      </w:r>
+      <w:proofErr w:type="gramStart"/>
+      <w:r>
+        <w:rPr>
+          <w:rFonts w:ascii="Consolas" w:hAnsi="Consolas"/>
+          <w:sz w:val="16"/>
+          <w:szCs w:val="16"/>
+        </w:rPr>
+        <w:t>61  0</w:t>
+      </w:r>
+      <w:proofErr w:type="gramEnd"/>
+      <w:r>
+        <w:rPr>
+          <w:rFonts w:ascii="Consolas" w:hAnsi="Consolas"/>
+          <w:sz w:val="16"/>
+          <w:szCs w:val="16"/>
+        </w:rPr>
+        <w:t xml:space="preserve">  0        71      1    </w:t>
+      </w:r>
+      <w:proofErr w:type="gramStart"/>
+      <w:r>
+        <w:rPr>
+          <w:rFonts w:ascii="Consolas" w:hAnsi="Consolas"/>
+          <w:sz w:val="16"/>
+          <w:szCs w:val="16"/>
+        </w:rPr>
+        <w:t>T  0</w:t>
+      </w:r>
+      <w:proofErr w:type="gramEnd"/>
+      <w:r>
+        <w:rPr>
+          <w:rFonts w:ascii="Consolas" w:hAnsi="Consolas"/>
+          <w:sz w:val="16"/>
+          <w:szCs w:val="16"/>
+        </w:rPr>
+        <w:t xml:space="preserve">  </w:t>
+      </w:r>
+      <w:proofErr w:type="gramStart"/>
+      <w:r>
+        <w:rPr>
+          <w:rFonts w:ascii="Consolas" w:hAnsi="Consolas"/>
+          <w:sz w:val="16"/>
+          <w:szCs w:val="16"/>
+        </w:rPr>
+        <w:t>0  3</w:t>
+      </w:r>
+      <w:proofErr w:type="gramEnd"/>
     </w:p>
     <w:p>
       <w:pPr>
@@ -3301,7 +3545,43 @@
           <w:sz w:val="16"/>
           <w:szCs w:val="16"/>
         </w:rPr>
-        <w:t xml:space="preserve">  0 62 12  0  0        74      1    G  0  0 69</w:t>
+        <w:t xml:space="preserve">  0 62 </w:t>
+      </w:r>
+      <w:proofErr w:type="gramStart"/>
+      <w:r>
+        <w:rPr>
+          <w:rFonts w:ascii="Consolas" w:hAnsi="Consolas"/>
+          <w:sz w:val="16"/>
+          <w:szCs w:val="16"/>
+        </w:rPr>
+        <w:t>12  0</w:t>
+      </w:r>
+      <w:proofErr w:type="gramEnd"/>
+      <w:r>
+        <w:rPr>
+          <w:rFonts w:ascii="Consolas" w:hAnsi="Consolas"/>
+          <w:sz w:val="16"/>
+          <w:szCs w:val="16"/>
+        </w:rPr>
+        <w:t xml:space="preserve">  0        74      1    </w:t>
+      </w:r>
+      <w:proofErr w:type="gramStart"/>
+      <w:r>
+        <w:rPr>
+          <w:rFonts w:ascii="Consolas" w:hAnsi="Consolas"/>
+          <w:sz w:val="16"/>
+          <w:szCs w:val="16"/>
+        </w:rPr>
+        <w:t>G  0</w:t>
+      </w:r>
+      <w:proofErr w:type="gramEnd"/>
+      <w:r>
+        <w:rPr>
+          <w:rFonts w:ascii="Consolas" w:hAnsi="Consolas"/>
+          <w:sz w:val="16"/>
+          <w:szCs w:val="16"/>
+        </w:rPr>
+        <w:t xml:space="preserve">  0 69</w:t>
       </w:r>
     </w:p>
     <w:p>
@@ -3337,7 +3617,79 @@
           <w:sz w:val="16"/>
           <w:szCs w:val="16"/>
         </w:rPr>
-        <w:t xml:space="preserve"> 11  0  0  0        78      1    A 83  0  3</w:t>
+        <w:t xml:space="preserve"> </w:t>
+      </w:r>
+      <w:proofErr w:type="gramStart"/>
+      <w:r>
+        <w:rPr>
+          <w:rFonts w:ascii="Consolas" w:hAnsi="Consolas"/>
+          <w:sz w:val="16"/>
+          <w:szCs w:val="16"/>
+        </w:rPr>
+        <w:t>11  0</w:t>
+      </w:r>
+      <w:proofErr w:type="gramEnd"/>
+      <w:r>
+        <w:rPr>
+          <w:rFonts w:ascii="Consolas" w:hAnsi="Consolas"/>
+          <w:sz w:val="16"/>
+          <w:szCs w:val="16"/>
+        </w:rPr>
+        <w:t xml:space="preserve">  </w:t>
+      </w:r>
+      <w:proofErr w:type="gramStart"/>
+      <w:r>
+        <w:rPr>
+          <w:rFonts w:ascii="Consolas" w:hAnsi="Consolas"/>
+          <w:sz w:val="16"/>
+          <w:szCs w:val="16"/>
+        </w:rPr>
+        <w:t>0  0</w:t>
+      </w:r>
+      <w:proofErr w:type="gramEnd"/>
+      <w:r>
+        <w:rPr>
+          <w:rFonts w:ascii="Consolas" w:hAnsi="Consolas"/>
+          <w:sz w:val="16"/>
+          <w:szCs w:val="16"/>
+        </w:rPr>
+        <w:t xml:space="preserve">        78      1    </w:t>
+      </w:r>
+      <w:proofErr w:type="gramStart"/>
+      <w:r>
+        <w:rPr>
+          <w:rFonts w:ascii="Consolas" w:hAnsi="Consolas"/>
+          <w:sz w:val="16"/>
+          <w:szCs w:val="16"/>
+        </w:rPr>
+        <w:t>A</w:t>
+      </w:r>
+      <w:proofErr w:type="gramEnd"/>
+      <w:r>
+        <w:rPr>
+          <w:rFonts w:ascii="Consolas" w:hAnsi="Consolas"/>
+          <w:sz w:val="16"/>
+          <w:szCs w:val="16"/>
+        </w:rPr>
+        <w:t xml:space="preserve"> </w:t>
+      </w:r>
+      <w:proofErr w:type="gramStart"/>
+      <w:r>
+        <w:rPr>
+          <w:rFonts w:ascii="Consolas" w:hAnsi="Consolas"/>
+          <w:sz w:val="16"/>
+          <w:szCs w:val="16"/>
+        </w:rPr>
+        <w:t>83  0</w:t>
+      </w:r>
+      <w:proofErr w:type="gramEnd"/>
+      <w:r>
+        <w:rPr>
+          <w:rFonts w:ascii="Consolas" w:hAnsi="Consolas"/>
+          <w:sz w:val="16"/>
+          <w:szCs w:val="16"/>
+        </w:rPr>
+        <w:t xml:space="preserve">  3</w:t>
       </w:r>
     </w:p>
     <w:p>
@@ -3396,13 +3748,19 @@
       <w:r>
         <w:t xml:space="preserve"> give the “</w:t>
       </w:r>
-      <w:proofErr w:type="spellStart"/>
       <w:r>
         <w:t>numberOfProcesors</w:t>
       </w:r>
-      <w:proofErr w:type="spellEnd"/>
-      <w:r>
-        <w:t xml:space="preserve">” variable at maximum the number of processor minus 2. </w:t>
+      <w:r>
+        <w:t xml:space="preserve">” variable at maximum the number of </w:t>
+      </w:r>
+      <w:proofErr w:type="gramStart"/>
+      <w:r>
+        <w:t>processor</w:t>
+      </w:r>
+      <w:proofErr w:type="gramEnd"/>
+      <w:r>
+        <w:t xml:space="preserve"> minus 2. </w:t>
       </w:r>
     </w:p>
     <w:p>
@@ -3471,23 +3829,7 @@
         <w:spacing w:after="0" w:line="240" w:lineRule="auto"/>
       </w:pPr>
       <w:r>
-        <w:t>For the “</w:t>
-      </w:r>
-      <w:proofErr w:type="spellStart"/>
-      <w:r>
-        <w:t>rejectThreshold</w:t>
-      </w:r>
-      <w:proofErr w:type="spellEnd"/>
-      <w:r>
-        <w:t xml:space="preserve">” variable select an appropriate value (read </w:t>
-      </w:r>
-      <w:proofErr w:type="spellStart"/>
-      <w:r>
-        <w:t>Benajamini</w:t>
-      </w:r>
-      <w:proofErr w:type="spellEnd"/>
-      <w:r>
-        <w:t xml:space="preserve"> et </w:t>
+        <w:t xml:space="preserve">For the “rejectThreshold” variable select an appropriate value (read Benajamini et </w:t>
       </w:r>
       <w:proofErr w:type="gramStart"/>
       <w:r>
@@ -3532,16 +3874,16 @@
           <w:sz w:val="16"/>
           <w:szCs w:val="16"/>
         </w:rPr>
-        <w:t>head(</w:t>
-      </w:r>
-      <w:proofErr w:type="gramEnd"/>
-      <w:r>
-        <w:rPr>
-          <w:rFonts w:ascii="Consolas" w:hAnsi="Consolas"/>
-          <w:sz w:val="16"/>
-          <w:szCs w:val="16"/>
-        </w:rPr>
-        <w:t>pol, n=</w:t>
+        <w:t>head(pol</w:t>
+      </w:r>
+      <w:proofErr w:type="gramEnd"/>
+      <w:r>
+        <w:rPr>
+          <w:rFonts w:ascii="Consolas" w:hAnsi="Consolas"/>
+          <w:sz w:val="16"/>
+          <w:szCs w:val="16"/>
+        </w:rPr>
+        <w:t>, n=</w:t>
       </w:r>
       <w:r>
         <w:rPr>
@@ -3635,7 +3977,61 @@
           <w:sz w:val="16"/>
           <w:szCs w:val="16"/>
         </w:rPr>
-        <w:t xml:space="preserve">  0 52  0  0  0        52      1    G  0  0 49</w:t>
+        <w:t xml:space="preserve">  0 </w:t>
+      </w:r>
+      <w:proofErr w:type="gramStart"/>
+      <w:r>
+        <w:rPr>
+          <w:rFonts w:ascii="Consolas" w:hAnsi="Consolas"/>
+          <w:sz w:val="16"/>
+          <w:szCs w:val="16"/>
+        </w:rPr>
+        <w:t>52  0</w:t>
+      </w:r>
+      <w:proofErr w:type="gramEnd"/>
+      <w:r>
+        <w:rPr>
+          <w:rFonts w:ascii="Consolas" w:hAnsi="Consolas"/>
+          <w:sz w:val="16"/>
+          <w:szCs w:val="16"/>
+        </w:rPr>
+        <w:t xml:space="preserve">  </w:t>
+      </w:r>
+      <w:proofErr w:type="gramStart"/>
+      <w:r>
+        <w:rPr>
+          <w:rFonts w:ascii="Consolas" w:hAnsi="Consolas"/>
+          <w:sz w:val="16"/>
+          <w:szCs w:val="16"/>
+        </w:rPr>
+        <w:t>0  0</w:t>
+      </w:r>
+      <w:proofErr w:type="gramEnd"/>
+      <w:r>
+        <w:rPr>
+          <w:rFonts w:ascii="Consolas" w:hAnsi="Consolas"/>
+          <w:sz w:val="16"/>
+          <w:szCs w:val="16"/>
+        </w:rPr>
+        <w:t xml:space="preserve">        52      1    </w:t>
+      </w:r>
+      <w:proofErr w:type="gramStart"/>
+      <w:r>
+        <w:rPr>
+          <w:rFonts w:ascii="Consolas" w:hAnsi="Consolas"/>
+          <w:sz w:val="16"/>
+          <w:szCs w:val="16"/>
+        </w:rPr>
+        <w:t>G  0</w:t>
+      </w:r>
+      <w:proofErr w:type="gramEnd"/>
+      <w:r>
+        <w:rPr>
+          <w:rFonts w:ascii="Consolas" w:hAnsi="Consolas"/>
+          <w:sz w:val="16"/>
+          <w:szCs w:val="16"/>
+        </w:rPr>
+        <w:t xml:space="preserve">  0 49</w:t>
       </w:r>
     </w:p>
     <w:p>
@@ -3671,7 +4067,61 @@
           <w:sz w:val="16"/>
           <w:szCs w:val="16"/>
         </w:rPr>
-        <w:t xml:space="preserve">  0  0  0  0        64      1    A 59  0  1</w:t>
+        <w:t xml:space="preserve">  </w:t>
+      </w:r>
+      <w:proofErr w:type="gramStart"/>
+      <w:r>
+        <w:rPr>
+          <w:rFonts w:ascii="Consolas" w:hAnsi="Consolas"/>
+          <w:sz w:val="16"/>
+          <w:szCs w:val="16"/>
+        </w:rPr>
+        <w:t>0  0</w:t>
+      </w:r>
+      <w:proofErr w:type="gramEnd"/>
+      <w:r>
+        <w:rPr>
+          <w:rFonts w:ascii="Consolas" w:hAnsi="Consolas"/>
+          <w:sz w:val="16"/>
+          <w:szCs w:val="16"/>
+        </w:rPr>
+        <w:t xml:space="preserve">  </w:t>
+      </w:r>
+      <w:proofErr w:type="gramStart"/>
+      <w:r>
+        <w:rPr>
+          <w:rFonts w:ascii="Consolas" w:hAnsi="Consolas"/>
+          <w:sz w:val="16"/>
+          <w:szCs w:val="16"/>
+        </w:rPr>
+        <w:t>0  0</w:t>
+      </w:r>
+      <w:proofErr w:type="gramEnd"/>
+      <w:r>
+        <w:rPr>
+          <w:rFonts w:ascii="Consolas" w:hAnsi="Consolas"/>
+          <w:sz w:val="16"/>
+          <w:szCs w:val="16"/>
+        </w:rPr>
+        <w:t xml:space="preserve">        64      1    A </w:t>
+      </w:r>
+      <w:proofErr w:type="gramStart"/>
+      <w:r>
+        <w:rPr>
+          <w:rFonts w:ascii="Consolas" w:hAnsi="Consolas"/>
+          <w:sz w:val="16"/>
+          <w:szCs w:val="16"/>
+        </w:rPr>
+        <w:t>59  0</w:t>
+      </w:r>
+      <w:proofErr w:type="gramEnd"/>
+      <w:r>
+        <w:rPr>
+          <w:rFonts w:ascii="Consolas" w:hAnsi="Consolas"/>
+          <w:sz w:val="16"/>
+          <w:szCs w:val="16"/>
+        </w:rPr>
+        <w:t xml:space="preserve">  1</w:t>
       </w:r>
     </w:p>
     <w:p>
@@ -3707,8 +4157,54 @@
           <w:sz w:val="16"/>
           <w:szCs w:val="16"/>
         </w:rPr>
-        <w:t xml:space="preserve">  0 10 61  0  0        71      1    T  0  0  3</w:t>
-      </w:r>
+        <w:t xml:space="preserve">  0 10 </w:t>
+      </w:r>
+      <w:proofErr w:type="gramStart"/>
+      <w:r>
+        <w:rPr>
+          <w:rFonts w:ascii="Consolas" w:hAnsi="Consolas"/>
+          <w:sz w:val="16"/>
+          <w:szCs w:val="16"/>
+        </w:rPr>
+        <w:t>61  0</w:t>
+      </w:r>
+      <w:proofErr w:type="gramEnd"/>
+      <w:r>
+        <w:rPr>
+          <w:rFonts w:ascii="Consolas" w:hAnsi="Consolas"/>
+          <w:sz w:val="16"/>
+          <w:szCs w:val="16"/>
+        </w:rPr>
+        <w:t xml:space="preserve">  0        71      1    </w:t>
+      </w:r>
+      <w:proofErr w:type="gramStart"/>
+      <w:r>
+        <w:rPr>
+          <w:rFonts w:ascii="Consolas" w:hAnsi="Consolas"/>
+          <w:sz w:val="16"/>
+          <w:szCs w:val="16"/>
+        </w:rPr>
+        <w:t>T  0</w:t>
+      </w:r>
+      <w:proofErr w:type="gramEnd"/>
+      <w:r>
+        <w:rPr>
+          <w:rFonts w:ascii="Consolas" w:hAnsi="Consolas"/>
+          <w:sz w:val="16"/>
+          <w:szCs w:val="16"/>
+        </w:rPr>
+        <w:t xml:space="preserve">  </w:t>
+      </w:r>
+      <w:proofErr w:type="gramStart"/>
+      <w:r>
+        <w:rPr>
+          <w:rFonts w:ascii="Consolas" w:hAnsi="Consolas"/>
+          <w:sz w:val="16"/>
+          <w:szCs w:val="16"/>
+        </w:rPr>
+        <w:t>0  3</w:t>
+      </w:r>
+      <w:proofErr w:type="gramEnd"/>
     </w:p>
     <w:p>
       <w:pPr>
@@ -3743,7 +4239,43 @@
           <w:sz w:val="16"/>
           <w:szCs w:val="16"/>
         </w:rPr>
-        <w:t xml:space="preserve">  0 62 12  0  0        74      1    G  0  0 69</w:t>
+        <w:t xml:space="preserve">  0 62 </w:t>
+      </w:r>
+      <w:proofErr w:type="gramStart"/>
+      <w:r>
+        <w:rPr>
+          <w:rFonts w:ascii="Consolas" w:hAnsi="Consolas"/>
+          <w:sz w:val="16"/>
+          <w:szCs w:val="16"/>
+        </w:rPr>
+        <w:t>12  0</w:t>
+      </w:r>
+      <w:proofErr w:type="gramEnd"/>
+      <w:r>
+        <w:rPr>
+          <w:rFonts w:ascii="Consolas" w:hAnsi="Consolas"/>
+          <w:sz w:val="16"/>
+          <w:szCs w:val="16"/>
+        </w:rPr>
+        <w:t xml:space="preserve">  0        74      1    </w:t>
+      </w:r>
+      <w:proofErr w:type="gramStart"/>
+      <w:r>
+        <w:rPr>
+          <w:rFonts w:ascii="Consolas" w:hAnsi="Consolas"/>
+          <w:sz w:val="16"/>
+          <w:szCs w:val="16"/>
+        </w:rPr>
+        <w:t>G  0</w:t>
+      </w:r>
+      <w:proofErr w:type="gramEnd"/>
+      <w:r>
+        <w:rPr>
+          <w:rFonts w:ascii="Consolas" w:hAnsi="Consolas"/>
+          <w:sz w:val="16"/>
+          <w:szCs w:val="16"/>
+        </w:rPr>
+        <w:t xml:space="preserve">  0 69</w:t>
       </w:r>
     </w:p>
     <w:p>
@@ -3779,7 +4311,79 @@
           <w:sz w:val="16"/>
           <w:szCs w:val="16"/>
         </w:rPr>
-        <w:t xml:space="preserve"> 11  0  0  0        78      1    A 83  0  3</w:t>
+        <w:t xml:space="preserve"> </w:t>
+      </w:r>
+      <w:proofErr w:type="gramStart"/>
+      <w:r>
+        <w:rPr>
+          <w:rFonts w:ascii="Consolas" w:hAnsi="Consolas"/>
+          <w:sz w:val="16"/>
+          <w:szCs w:val="16"/>
+        </w:rPr>
+        <w:t>11  0</w:t>
+      </w:r>
+      <w:proofErr w:type="gramEnd"/>
+      <w:r>
+        <w:rPr>
+          <w:rFonts w:ascii="Consolas" w:hAnsi="Consolas"/>
+          <w:sz w:val="16"/>
+          <w:szCs w:val="16"/>
+        </w:rPr>
+        <w:t xml:space="preserve">  </w:t>
+      </w:r>
+      <w:proofErr w:type="gramStart"/>
+      <w:r>
+        <w:rPr>
+          <w:rFonts w:ascii="Consolas" w:hAnsi="Consolas"/>
+          <w:sz w:val="16"/>
+          <w:szCs w:val="16"/>
+        </w:rPr>
+        <w:t>0  0</w:t>
+      </w:r>
+      <w:proofErr w:type="gramEnd"/>
+      <w:r>
+        <w:rPr>
+          <w:rFonts w:ascii="Consolas" w:hAnsi="Consolas"/>
+          <w:sz w:val="16"/>
+          <w:szCs w:val="16"/>
+        </w:rPr>
+        <w:t xml:space="preserve">        78      1    </w:t>
+      </w:r>
+      <w:proofErr w:type="gramStart"/>
+      <w:r>
+        <w:rPr>
+          <w:rFonts w:ascii="Consolas" w:hAnsi="Consolas"/>
+          <w:sz w:val="16"/>
+          <w:szCs w:val="16"/>
+        </w:rPr>
+        <w:t>A</w:t>
+      </w:r>
+      <w:proofErr w:type="gramEnd"/>
+      <w:r>
+        <w:rPr>
+          <w:rFonts w:ascii="Consolas" w:hAnsi="Consolas"/>
+          <w:sz w:val="16"/>
+          <w:szCs w:val="16"/>
+        </w:rPr>
+        <w:t xml:space="preserve"> </w:t>
+      </w:r>
+      <w:proofErr w:type="gramStart"/>
+      <w:r>
+        <w:rPr>
+          <w:rFonts w:ascii="Consolas" w:hAnsi="Consolas"/>
+          <w:sz w:val="16"/>
+          <w:szCs w:val="16"/>
+        </w:rPr>
+        <w:t>83  0</w:t>
+      </w:r>
+      <w:proofErr w:type="gramEnd"/>
+      <w:r>
+        <w:rPr>
+          <w:rFonts w:ascii="Consolas" w:hAnsi="Consolas"/>
+          <w:sz w:val="16"/>
+          <w:szCs w:val="16"/>
+        </w:rPr>
+        <w:t xml:space="preserve">  3</w:t>
       </w:r>
     </w:p>
     <w:p>
@@ -3830,11 +4434,9 @@
       <w:r>
         <w:t xml:space="preserve"> </w:t>
       </w:r>
-      <w:proofErr w:type="gramStart"/>
       <w:r>
         <w:t>results</w:t>
       </w:r>
-      <w:proofErr w:type="gramEnd"/>
     </w:p>
     <w:p>
       <w:pPr>
@@ -3950,24 +4552,7 @@
           <w:szCs w:val="16"/>
         </w:rPr>
         <w:tab/>
-      </w:r>
-      <w:proofErr w:type="spellStart"/>
-      <w:r>
-        <w:rPr>
-          <w:rFonts w:ascii="Consolas" w:hAnsi="Consolas"/>
-          <w:sz w:val="16"/>
-          <w:szCs w:val="16"/>
-        </w:rPr>
-        <w:t>GA</w:t>
-      </w:r>
-      <w:proofErr w:type="spellEnd"/>
-      <w:r>
-        <w:rPr>
-          <w:rFonts w:ascii="Consolas" w:hAnsi="Consolas"/>
-          <w:sz w:val="16"/>
-          <w:szCs w:val="16"/>
-        </w:rPr>
-        <w:t>____</w:t>
+        <w:t>GA____</w:t>
       </w:r>
       <w:r>
         <w:rPr>
@@ -5448,13 +6033,8 @@
         <w:spacing w:after="0" w:line="240" w:lineRule="auto"/>
       </w:pPr>
       <w:r>
-        <w:t xml:space="preserve">Input </w:t>
-      </w:r>
-      <w:proofErr w:type="gramStart"/>
-      <w:r>
-        <w:t>data</w:t>
-      </w:r>
-      <w:proofErr w:type="gramEnd"/>
+        <w:t>Input data</w:t>
+      </w:r>
     </w:p>
     <w:p>
       <w:pPr>
@@ -5544,11 +6124,11 @@
         <w:spacing w:after="0" w:line="240" w:lineRule="auto"/>
       </w:pPr>
       <w:r>
-        <w:t xml:space="preserve">Then, run chromosome 1 for the second part Chrom1_2.trn until finishing chromosome </w:t>
-      </w:r>
-      <w:proofErr w:type="gramStart"/>
-      <w:r>
-        <w:t>1</w:t>
+        <w:t xml:space="preserve">Then, run chromosome 1 for the second part Chrom1_2.trn until </w:t>
+      </w:r>
+      <w:proofErr w:type="gramStart"/>
+      <w:r>
+        <w:t>finishing chromosome 1</w:t>
       </w:r>
       <w:proofErr w:type="gramEnd"/>
     </w:p>
@@ -5590,17 +6170,7 @@
         <w:spacing w:after="0" w:line="240" w:lineRule="auto"/>
       </w:pPr>
       <w:r>
-        <w:t xml:space="preserve">This program adds the residue number, the type of substitution, the reference and alternative </w:t>
-      </w:r>
-      <w:proofErr w:type="spellStart"/>
-      <w:proofErr w:type="gramStart"/>
-      <w:r>
-        <w:t>aminoacid</w:t>
-      </w:r>
-      <w:proofErr w:type="spellEnd"/>
-      <w:proofErr w:type="gramEnd"/>
-      <w:r>
-        <w:t>. The data it is still by SNP per chromosome (several files per chromosome)</w:t>
+        <w:t>This program adds the residue number, the type of substitution, the reference and alternative aminoacid. The data it is still by SNP per chromosome (several files per chromosome)</w:t>
       </w:r>
     </w:p>
     <w:p>
@@ -5619,13 +6189,8 @@
         <w:spacing w:after="0" w:line="240" w:lineRule="auto"/>
       </w:pPr>
       <w:r>
-        <w:t xml:space="preserve">Input </w:t>
-      </w:r>
-      <w:proofErr w:type="gramStart"/>
-      <w:r>
-        <w:t>data</w:t>
-      </w:r>
-      <w:proofErr w:type="gramEnd"/>
+        <w:t>Input data</w:t>
+      </w:r>
     </w:p>
     <w:p>
       <w:pPr>
@@ -5702,11 +6267,11 @@
         <w:spacing w:after="0" w:line="240" w:lineRule="auto"/>
       </w:pPr>
       <w:r>
-        <w:t xml:space="preserve">Then, run to Chrom1_2.ant until finishing chromosome </w:t>
-      </w:r>
-      <w:proofErr w:type="gramStart"/>
-      <w:r>
-        <w:t>1</w:t>
+        <w:t xml:space="preserve">Then, run to Chrom1_2.ant until </w:t>
+      </w:r>
+      <w:proofErr w:type="gramStart"/>
+      <w:r>
+        <w:t>finishing chromosome 1</w:t>
       </w:r>
       <w:proofErr w:type="gramEnd"/>
     </w:p>
@@ -5737,7 +6302,6 @@
         </w:rPr>
         <w:t xml:space="preserve">. </w:t>
       </w:r>
-      <w:proofErr w:type="spellStart"/>
       <w:r>
         <w:rPr>
           <w:b/>
@@ -5745,7 +6309,6 @@
         </w:rPr>
         <w:t>PerGene</w:t>
       </w:r>
-      <w:proofErr w:type="spellEnd"/>
     </w:p>
     <w:p>
       <w:pPr>
@@ -5768,20 +6331,23 @@
         <w:spacing w:after="0" w:line="240" w:lineRule="auto"/>
       </w:pPr>
       <w:r>
-        <w:t xml:space="preserve">Requires the first LOC# in the replace file. Use the following </w:t>
-      </w:r>
-      <w:proofErr w:type="gramStart"/>
-      <w:r>
-        <w:t>command</w:t>
-      </w:r>
-      <w:proofErr w:type="gramEnd"/>
-    </w:p>
-    <w:p>
-      <w:pPr>
-        <w:spacing w:after="0" w:line="240" w:lineRule="auto"/>
-      </w:pPr>
-      <w:r>
-        <w:t>awk '/LOC/ {print}</w:t>
+        <w:t>Requires the first LOC# in the replace file. Use the following command</w:t>
+      </w:r>
+    </w:p>
+    <w:p>
+      <w:pPr>
+        <w:spacing w:after="0" w:line="240" w:lineRule="auto"/>
+      </w:pPr>
+      <w:r>
+        <w:t>awk '/</w:t>
+      </w:r>
+      <w:proofErr w:type="gramStart"/>
+      <w:r>
+        <w:t>LOC/ {</w:t>
+      </w:r>
+      <w:proofErr w:type="gramEnd"/>
+      <w:r>
+        <w:t>print}</w:t>
       </w:r>
       <w:proofErr w:type="gramStart"/>
       <w:r>
@@ -5792,8 +6358,13 @@
       </w:r>
       <w:proofErr w:type="gramEnd"/>
       <w:r>
-        <w:t>_AvD.c1_1.replace</w:t>
-      </w:r>
+        <w:t>_AvD.c1_</w:t>
+      </w:r>
+      <w:proofErr w:type="gramStart"/>
+      <w:r>
+        <w:t>1.replace</w:t>
+      </w:r>
+      <w:proofErr w:type="gramEnd"/>
       <w:r>
         <w:t xml:space="preserve">  | head</w:t>
       </w:r>
@@ -5822,13 +6393,8 @@
         <w:spacing w:after="0" w:line="240" w:lineRule="auto"/>
       </w:pPr>
       <w:r>
-        <w:t xml:space="preserve">Input </w:t>
-      </w:r>
-      <w:proofErr w:type="gramStart"/>
-      <w:r>
-        <w:t>data</w:t>
-      </w:r>
-      <w:proofErr w:type="gramEnd"/>
+        <w:t>Input data</w:t>
+      </w:r>
     </w:p>
     <w:p>
       <w:pPr>
@@ -5952,7 +6518,7 @@
 </file>
 
 <file path=word/numbering.xml><?xml version="1.0" encoding="utf-8"?>
-<w:numbering xmlns:wpc="http://schemas.microsoft.com/office/word/2010/wordprocessingCanvas" xmlns:cx="http://schemas.microsoft.com/office/drawing/2014/chartex" xmlns:cx1="http://schemas.microsoft.com/office/drawing/2015/9/8/chartex" xmlns:cx2="http://schemas.microsoft.com/office/drawing/2015/10/21/chartex" xmlns:cx3="http://schemas.microsoft.com/office/drawing/2016/5/9/chartex" xmlns:cx4="http://schemas.microsoft.com/office/drawing/2016/5/10/chartex" xmlns:cx5="http://schemas.microsoft.com/office/drawing/2016/5/11/chartex" xmlns:cx6="http://schemas.microsoft.com/office/drawing/2016/5/12/chartex" xmlns:cx7="http://schemas.microsoft.com/office/drawing/2016/5/13/chartex" xmlns:cx8="http://schemas.microsoft.com/office/drawing/2016/5/14/chartex" xmlns:mc="http://schemas.openxmlformats.org/markup-compatibility/2006" xmlns:aink="http://schemas.microsoft.com/office/drawing/2016/ink" xmlns:am3d="http://schemas.microsoft.com/office/drawing/2017/model3d" xmlns:o="urn:schemas-microsoft-com:office:office" xmlns:oel="http://schemas.microsoft.com/office/2019/extlst" xmlns:r="http://schemas.openxmlformats.org/officeDocument/2006/relationships" xmlns:m="http://schemas.openxmlformats.org/officeDocument/2006/math" xmlns:v="urn:schemas-microsoft-com:vml" xmlns:wp14="http://schemas.microsoft.com/office/word/2010/wordprocessingDrawing" xmlns:wp="http://schemas.openxmlformats.org/drawingml/2006/wordprocessingDrawing" xmlns:w10="urn:schemas-microsoft-com:office:word" xmlns:w="http://schemas.openxmlformats.org/wordprocessingml/2006/main" xmlns:w14="http://schemas.microsoft.com/office/word/2010/wordml" xmlns:w15="http://schemas.microsoft.com/office/word/2012/wordml" xmlns:w16cex="http://schemas.microsoft.com/office/word/2018/wordml/cex" xmlns:w16cid="http://schemas.microsoft.com/office/word/2016/wordml/cid" xmlns:w16="http://schemas.microsoft.com/office/word/2018/wordml" xmlns:w16du="http://schemas.microsoft.com/office/word/2023/wordml/word16du" xmlns:w16sdtdh="http://schemas.microsoft.com/office/word/2020/wordml/sdtdatahash" xmlns:w16se="http://schemas.microsoft.com/office/word/2015/wordml/symex" xmlns:wpg="http://schemas.microsoft.com/office/word/2010/wordprocessingGroup" xmlns:wpi="http://schemas.microsoft.com/office/word/2010/wordprocessingInk" xmlns:wne="http://schemas.microsoft.com/office/word/2006/wordml" xmlns:wps="http://schemas.microsoft.com/office/word/2010/wordprocessingShape" mc:Ignorable="w14 w15 w16se w16cid w16 w16cex w16sdtdh w16du wp14">
+<w:numbering xmlns:wpc="http://schemas.microsoft.com/office/word/2010/wordprocessingCanvas" xmlns:cx="http://schemas.microsoft.com/office/drawing/2014/chartex" xmlns:cx1="http://schemas.microsoft.com/office/drawing/2015/9/8/chartex" xmlns:cx2="http://schemas.microsoft.com/office/drawing/2015/10/21/chartex" xmlns:cx3="http://schemas.microsoft.com/office/drawing/2016/5/9/chartex" xmlns:cx4="http://schemas.microsoft.com/office/drawing/2016/5/10/chartex" xmlns:cx5="http://schemas.microsoft.com/office/drawing/2016/5/11/chartex" xmlns:cx6="http://schemas.microsoft.com/office/drawing/2016/5/12/chartex" xmlns:cx7="http://schemas.microsoft.com/office/drawing/2016/5/13/chartex" xmlns:cx8="http://schemas.microsoft.com/office/drawing/2016/5/14/chartex" xmlns:mc="http://schemas.openxmlformats.org/markup-compatibility/2006" xmlns:aink="http://schemas.microsoft.com/office/drawing/2016/ink" xmlns:am3d="http://schemas.microsoft.com/office/drawing/2017/model3d" xmlns:o="urn:schemas-microsoft-com:office:office" xmlns:oel="http://schemas.microsoft.com/office/2019/extlst" xmlns:r="http://schemas.openxmlformats.org/officeDocument/2006/relationships" xmlns:m="http://schemas.openxmlformats.org/officeDocument/2006/math" xmlns:v="urn:schemas-microsoft-com:vml" xmlns:wp14="http://schemas.microsoft.com/office/word/2010/wordprocessingDrawing" xmlns:wp="http://schemas.openxmlformats.org/drawingml/2006/wordprocessingDrawing" xmlns:w10="urn:schemas-microsoft-com:office:word" xmlns:w="http://schemas.openxmlformats.org/wordprocessingml/2006/main" xmlns:w14="http://schemas.microsoft.com/office/word/2010/wordml" xmlns:w15="http://schemas.microsoft.com/office/word/2012/wordml" xmlns:w16cex="http://schemas.microsoft.com/office/word/2018/wordml/cex" xmlns:w16cid="http://schemas.microsoft.com/office/word/2016/wordml/cid" xmlns:w16="http://schemas.microsoft.com/office/word/2018/wordml" xmlns:w16du="http://schemas.microsoft.com/office/word/2023/wordml/word16du" xmlns:w16sdtdh="http://schemas.microsoft.com/office/word/2020/wordml/sdtdatahash" xmlns:w16sdtfl="http://schemas.microsoft.com/office/word/2024/wordml/sdtformatlock" xmlns:w16se="http://schemas.microsoft.com/office/word/2015/wordml/symex" xmlns:wpg="http://schemas.microsoft.com/office/word/2010/wordprocessingGroup" xmlns:wpi="http://schemas.microsoft.com/office/word/2010/wordprocessingInk" xmlns:wne="http://schemas.microsoft.com/office/word/2006/wordml" xmlns:wps="http://schemas.microsoft.com/office/word/2010/wordprocessingShape" mc:Ignorable="w14 w15 w16se w16cid w16 w16cex w16sdtdh w16sdtfl w16du wp14">
   <w:abstractNum w:abstractNumId="0" w15:restartNumberingAfterBreak="0">
     <w:nsid w:val="34363FE6"/>
     <w:multiLevelType w:val="hybridMultilevel"/>
@@ -6049,7 +6615,7 @@
 </file>
 
 <file path=word/styles.xml><?xml version="1.0" encoding="utf-8"?>
-<w:styles xmlns:mc="http://schemas.openxmlformats.org/markup-compatibility/2006" xmlns:r="http://schemas.openxmlformats.org/officeDocument/2006/relationships" xmlns:w="http://schemas.openxmlformats.org/wordprocessingml/2006/main" xmlns:w14="http://schemas.microsoft.com/office/word/2010/wordml" xmlns:w15="http://schemas.microsoft.com/office/word/2012/wordml" xmlns:w16cex="http://schemas.microsoft.com/office/word/2018/wordml/cex" xmlns:w16cid="http://schemas.microsoft.com/office/word/2016/wordml/cid" xmlns:w16="http://schemas.microsoft.com/office/word/2018/wordml" xmlns:w16du="http://schemas.microsoft.com/office/word/2023/wordml/word16du" xmlns:w16sdtdh="http://schemas.microsoft.com/office/word/2020/wordml/sdtdatahash" xmlns:w16se="http://schemas.microsoft.com/office/word/2015/wordml/symex" mc:Ignorable="w14 w15 w16se w16cid w16 w16cex w16sdtdh w16du">
+<w:styles xmlns:mc="http://schemas.openxmlformats.org/markup-compatibility/2006" xmlns:r="http://schemas.openxmlformats.org/officeDocument/2006/relationships" xmlns:w="http://schemas.openxmlformats.org/wordprocessingml/2006/main" xmlns:w14="http://schemas.microsoft.com/office/word/2010/wordml" xmlns:w15="http://schemas.microsoft.com/office/word/2012/wordml" xmlns:w16cex="http://schemas.microsoft.com/office/word/2018/wordml/cex" xmlns:w16cid="http://schemas.microsoft.com/office/word/2016/wordml/cid" xmlns:w16="http://schemas.microsoft.com/office/word/2018/wordml" xmlns:w16du="http://schemas.microsoft.com/office/word/2023/wordml/word16du" xmlns:w16sdtdh="http://schemas.microsoft.com/office/word/2020/wordml/sdtdatahash" xmlns:w16sdtfl="http://schemas.microsoft.com/office/word/2024/wordml/sdtformatlock" xmlns:w16se="http://schemas.microsoft.com/office/word/2015/wordml/symex" mc:Ignorable="w14 w15 w16se w16cid w16 w16cex w16sdtdh w16sdtfl w16du">
   <w:docDefaults>
     <w:rPrDefault>
       <w:rPr>

</xml_diff>